<commit_message>
Copy text and resume adjustments
</commit_message>
<xml_diff>
--- a/files/resume.docx
+++ b/files/resume.docx
@@ -5,7 +5,7 @@
     <w:p>
       <w:pPr>
         <w:spacing w:line="240" w:lineRule="auto"/>
-        <w:ind w:right="360"/>
+        <w:ind w:right="0"/>
         <w:rPr>
           <w:rFonts w:ascii="Times New Roman" w:cs="Times New Roman" w:eastAsia="Times New Roman" w:hAnsi="Times New Roman"/>
           <w:b w:val="1"/>
@@ -31,7 +31,7 @@
     <w:p>
       <w:pPr>
         <w:spacing w:line="240" w:lineRule="auto"/>
-        <w:ind w:right="360"/>
+        <w:ind w:right="0"/>
         <w:rPr>
           <w:rFonts w:ascii="Times New Roman" w:cs="Times New Roman" w:eastAsia="Times New Roman" w:hAnsi="Times New Roman"/>
           <w:sz w:val="28"/>
@@ -54,7 +54,7 @@
           <w:bottom w:color="0b5394" w:space="2" w:sz="8" w:val="single"/>
         </w:pBdr>
         <w:spacing w:line="240" w:lineRule="auto"/>
-        <w:ind w:right="360"/>
+        <w:ind w:right="0"/>
         <w:rPr>
           <w:rFonts w:ascii="Times New Roman" w:cs="Times New Roman" w:eastAsia="Times New Roman" w:hAnsi="Times New Roman"/>
           <w:b w:val="1"/>
@@ -160,11 +160,9 @@
     <w:p>
       <w:pPr>
         <w:spacing w:line="240" w:lineRule="auto"/>
-        <w:ind w:right="360"/>
-        <w:rPr>
-          <w:rFonts w:ascii="Times New Roman" w:cs="Times New Roman" w:eastAsia="Times New Roman" w:hAnsi="Times New Roman"/>
-          <w:sz w:val="24"/>
-          <w:szCs w:val="24"/>
+        <w:ind w:right="0"/>
+        <w:rPr>
+          <w:rFonts w:ascii="Times New Roman" w:cs="Times New Roman" w:eastAsia="Times New Roman" w:hAnsi="Times New Roman"/>
         </w:rPr>
       </w:pPr>
       <w:r>
@@ -176,196 +174,204 @@
     <w:p>
       <w:pPr>
         <w:spacing w:line="288" w:lineRule="auto"/>
-        <w:ind w:right="360"/>
-        <w:rPr>
-          <w:rFonts w:ascii="Times New Roman" w:cs="Times New Roman" w:eastAsia="Times New Roman" w:hAnsi="Times New Roman"/>
-          <w:sz w:val="24"/>
-          <w:szCs w:val="24"/>
-        </w:rPr>
-      </w:pPr>
-      <w:r>
-        <w:rPr>
-          <w:rFonts w:ascii="Times New Roman" w:cs="Times New Roman" w:eastAsia="Times New Roman" w:hAnsi="Times New Roman"/>
-          <w:b w:val="1"/>
-          <w:bCs w:val="1"/>
-          <w:sz w:val="24"/>
-          <w:szCs w:val="24"/>
-          <w:rtl w:val="0"/>
-        </w:rPr>
-        <w:t xml:space="preserve">Language</w:t>
-      </w:r>
-      <w:r>
-        <w:rPr>
-          <w:rFonts w:ascii="Times New Roman" w:cs="Times New Roman" w:eastAsia="Times New Roman" w:hAnsi="Times New Roman"/>
-          <w:b w:val="1"/>
-          <w:bCs w:val="1"/>
-          <w:sz w:val="24"/>
-          <w:szCs w:val="24"/>
-          <w:u w:val="single"/>
-          <w:rtl w:val="0"/>
-        </w:rPr>
-        <w:t xml:space="preserve">s</w:t>
-      </w:r>
-      <w:r>
-        <w:rPr>
-          <w:rFonts w:ascii="Times New Roman" w:cs="Times New Roman" w:eastAsia="Times New Roman" w:hAnsi="Times New Roman"/>
-          <w:sz w:val="24"/>
-          <w:szCs w:val="24"/>
-          <w:rtl w:val="0"/>
-        </w:rPr>
-        <w:t xml:space="preserve">:  C#,  Java,  C/C++</w:t>
+        <w:ind w:right="0"/>
+        <w:rPr>
+          <w:rFonts w:ascii="Times New Roman" w:cs="Times New Roman" w:eastAsia="Times New Roman" w:hAnsi="Times New Roman"/>
+        </w:rPr>
+      </w:pPr>
+      <w:r>
+        <w:rPr>
+          <w:rFonts w:ascii="Times New Roman" w:cs="Times New Roman" w:eastAsia="Times New Roman" w:hAnsi="Times New Roman"/>
+          <w:b w:val="1"/>
+          <w:bCs w:val="1"/>
+          <w:rtl w:val="0"/>
+        </w:rPr>
+        <w:t xml:space="preserve">Frontend:  </w:t>
+      </w:r>
+      <w:r>
+        <w:rPr>
+          <w:rFonts w:ascii="Times New Roman" w:cs="Times New Roman" w:eastAsia="Times New Roman" w:hAnsi="Times New Roman"/>
+          <w:rtl w:val="0"/>
+        </w:rPr>
+        <w:t xml:space="preserve">React (</w:t>
+      </w:r>
+      <w:r>
+        <w:rPr>
+          <w:rFonts w:ascii="Times New Roman" w:cs="Times New Roman" w:eastAsia="Times New Roman" w:hAnsi="Times New Roman"/>
+          <w:rtl w:val="0"/>
+        </w:rPr>
+        <w:t xml:space="preserve">Next.js</w:t>
+      </w:r>
+      <w:r>
+        <w:rPr>
+          <w:rFonts w:ascii="Times New Roman" w:cs="Times New Roman" w:eastAsia="Times New Roman" w:hAnsi="Times New Roman"/>
+          <w:rtl w:val="0"/>
+        </w:rPr>
+        <w:t xml:space="preserve">),  HTML/CSS,  SASS,  WebPack</w:t>
       </w:r>
     </w:p>
     <w:p>
       <w:pPr>
         <w:spacing w:line="288" w:lineRule="auto"/>
-        <w:ind w:right="360"/>
-        <w:rPr>
-          <w:rFonts w:ascii="Times New Roman" w:cs="Times New Roman" w:eastAsia="Times New Roman" w:hAnsi="Times New Roman"/>
-          <w:sz w:val="24"/>
-          <w:szCs w:val="24"/>
-        </w:rPr>
-      </w:pPr>
-      <w:r>
-        <w:rPr>
-          <w:rFonts w:ascii="Times New Roman" w:cs="Times New Roman" w:eastAsia="Times New Roman" w:hAnsi="Times New Roman"/>
-          <w:b w:val="1"/>
-          <w:bCs w:val="1"/>
-          <w:sz w:val="24"/>
-          <w:szCs w:val="24"/>
-          <w:rtl w:val="0"/>
-        </w:rPr>
-        <w:t xml:space="preserve">Web Development</w:t>
-      </w:r>
-      <w:r>
-        <w:rPr>
-          <w:rFonts w:ascii="Times New Roman" w:cs="Times New Roman" w:eastAsia="Times New Roman" w:hAnsi="Times New Roman"/>
-          <w:sz w:val="24"/>
-          <w:szCs w:val="24"/>
-          <w:rtl w:val="0"/>
-        </w:rPr>
-        <w:t xml:space="preserve">:  </w:t>
-      </w:r>
-      <w:r>
-        <w:rPr>
-          <w:rFonts w:ascii="Times New Roman" w:cs="Times New Roman" w:eastAsia="Times New Roman" w:hAnsi="Times New Roman"/>
-          <w:sz w:val="24"/>
-          <w:szCs w:val="24"/>
-          <w:rtl w:val="0"/>
-        </w:rPr>
-        <w:t xml:space="preserve">Node.js,  JavaScript,  </w:t>
-      </w:r>
-      <w:r>
-        <w:rPr>
-          <w:rFonts w:ascii="Times New Roman" w:cs="Times New Roman" w:eastAsia="Times New Roman" w:hAnsi="Times New Roman"/>
-          <w:sz w:val="24"/>
-          <w:szCs w:val="24"/>
-          <w:rtl w:val="0"/>
-        </w:rPr>
-        <w:t xml:space="preserve">CSS/SCSS,  HTML</w:t>
+        <w:ind w:right="0"/>
+        <w:rPr>
+          <w:rFonts w:ascii="Times New Roman" w:cs="Times New Roman" w:eastAsia="Times New Roman" w:hAnsi="Times New Roman"/>
+        </w:rPr>
+      </w:pPr>
+      <w:r>
+        <w:rPr>
+          <w:rFonts w:ascii="Times New Roman" w:cs="Times New Roman" w:eastAsia="Times New Roman" w:hAnsi="Times New Roman"/>
+          <w:b w:val="1"/>
+          <w:bCs w:val="1"/>
+          <w:rtl w:val="0"/>
+        </w:rPr>
+        <w:t xml:space="preserve">Backend:  </w:t>
+      </w:r>
+      <w:r>
+        <w:rPr>
+          <w:rFonts w:ascii="Times New Roman" w:cs="Times New Roman" w:eastAsia="Times New Roman" w:hAnsi="Times New Roman"/>
+          <w:rtl w:val="0"/>
+        </w:rPr>
+        <w:t xml:space="preserve">ASP.NET,  Node.js,  REST APIs,  MVC</w:t>
       </w:r>
     </w:p>
     <w:p>
       <w:pPr>
         <w:spacing w:line="288" w:lineRule="auto"/>
-        <w:ind w:right="360"/>
-        <w:rPr>
-          <w:rFonts w:ascii="Times New Roman" w:cs="Times New Roman" w:eastAsia="Times New Roman" w:hAnsi="Times New Roman"/>
-          <w:sz w:val="24"/>
-          <w:szCs w:val="24"/>
-        </w:rPr>
-      </w:pPr>
-      <w:r>
-        <w:rPr>
-          <w:rFonts w:ascii="Times New Roman" w:cs="Times New Roman" w:eastAsia="Times New Roman" w:hAnsi="Times New Roman"/>
-          <w:b w:val="1"/>
-          <w:bCs w:val="1"/>
-          <w:sz w:val="24"/>
-          <w:szCs w:val="24"/>
-          <w:rtl w:val="0"/>
-        </w:rPr>
-        <w:t xml:space="preserve">Databases</w:t>
-      </w:r>
-      <w:r>
-        <w:rPr>
-          <w:rFonts w:ascii="Times New Roman" w:cs="Times New Roman" w:eastAsia="Times New Roman" w:hAnsi="Times New Roman"/>
-          <w:sz w:val="24"/>
-          <w:szCs w:val="24"/>
-          <w:rtl w:val="0"/>
-        </w:rPr>
-        <w:t xml:space="preserve">:  SQL,  MongoDB</w:t>
+        <w:ind w:right="0"/>
+        <w:rPr>
+          <w:rFonts w:ascii="Times New Roman" w:cs="Times New Roman" w:eastAsia="Times New Roman" w:hAnsi="Times New Roman"/>
+        </w:rPr>
+      </w:pPr>
+      <w:r>
+        <w:rPr>
+          <w:rFonts w:ascii="Times New Roman" w:cs="Times New Roman" w:eastAsia="Times New Roman" w:hAnsi="Times New Roman"/>
+          <w:b w:val="1"/>
+          <w:bCs w:val="1"/>
+          <w:rtl w:val="0"/>
+        </w:rPr>
+        <w:t xml:space="preserve">Databases:  </w:t>
+      </w:r>
+      <w:r>
+        <w:rPr>
+          <w:rFonts w:ascii="Times New Roman" w:cs="Times New Roman" w:eastAsia="Times New Roman" w:hAnsi="Times New Roman"/>
+          <w:rtl w:val="0"/>
+        </w:rPr>
+        <w:t xml:space="preserve">MS SQL,  MongoDB</w:t>
+      </w:r>
+      <w:r>
+        <w:rPr>
+          <w:rtl w:val="0"/>
+        </w:rPr>
       </w:r>
     </w:p>
     <w:p>
       <w:pPr>
         <w:spacing w:line="288" w:lineRule="auto"/>
-        <w:ind w:right="360"/>
-        <w:rPr>
-          <w:rFonts w:ascii="Times New Roman" w:cs="Times New Roman" w:eastAsia="Times New Roman" w:hAnsi="Times New Roman"/>
-          <w:sz w:val="24"/>
-          <w:szCs w:val="24"/>
-        </w:rPr>
-      </w:pPr>
-      <w:r>
-        <w:rPr>
-          <w:rFonts w:ascii="Times New Roman" w:cs="Times New Roman" w:eastAsia="Times New Roman" w:hAnsi="Times New Roman"/>
-          <w:b w:val="1"/>
-          <w:bCs w:val="1"/>
-          <w:sz w:val="24"/>
-          <w:szCs w:val="24"/>
-          <w:rtl w:val="0"/>
-        </w:rPr>
-        <w:t xml:space="preserve">DevOps</w:t>
-      </w:r>
-      <w:r>
-        <w:rPr>
-          <w:rFonts w:ascii="Times New Roman" w:cs="Times New Roman" w:eastAsia="Times New Roman" w:hAnsi="Times New Roman"/>
-          <w:sz w:val="24"/>
-          <w:szCs w:val="24"/>
-          <w:rtl w:val="0"/>
-        </w:rPr>
-        <w:t xml:space="preserve">:  Azure,  Docker,  CI/CD,  IaC</w:t>
+        <w:ind w:right="0"/>
+        <w:rPr>
+          <w:rFonts w:ascii="Times New Roman" w:cs="Times New Roman" w:eastAsia="Times New Roman" w:hAnsi="Times New Roman"/>
+        </w:rPr>
+      </w:pPr>
+      <w:r>
+        <w:rPr>
+          <w:rFonts w:ascii="Times New Roman" w:cs="Times New Roman" w:eastAsia="Times New Roman" w:hAnsi="Times New Roman"/>
+          <w:b w:val="1"/>
+          <w:bCs w:val="1"/>
+          <w:rtl w:val="0"/>
+        </w:rPr>
+        <w:t xml:space="preserve">DevOps:  </w:t>
+      </w:r>
+      <w:r>
+        <w:rPr>
+          <w:rFonts w:ascii="Times New Roman" w:cs="Times New Roman" w:eastAsia="Times New Roman" w:hAnsi="Times New Roman"/>
+          <w:rtl w:val="0"/>
+        </w:rPr>
+        <w:t xml:space="preserve">Azure,  Docker,  CI/CD,  IaC (Terraform)</w:t>
       </w:r>
     </w:p>
     <w:p>
       <w:pPr>
         <w:spacing w:line="288" w:lineRule="auto"/>
-        <w:ind w:right="360"/>
-        <w:rPr>
-          <w:rFonts w:ascii="Times New Roman" w:cs="Times New Roman" w:eastAsia="Times New Roman" w:hAnsi="Times New Roman"/>
-          <w:sz w:val="24"/>
-          <w:szCs w:val="24"/>
-        </w:rPr>
-      </w:pPr>
-      <w:r>
-        <w:rPr>
-          <w:rFonts w:ascii="Times New Roman" w:cs="Times New Roman" w:eastAsia="Times New Roman" w:hAnsi="Times New Roman"/>
-          <w:b w:val="1"/>
-          <w:bCs w:val="1"/>
-          <w:sz w:val="24"/>
-          <w:szCs w:val="24"/>
-          <w:rtl w:val="0"/>
-        </w:rPr>
-        <w:t xml:space="preserve">Tools</w:t>
-      </w:r>
-      <w:r>
-        <w:rPr>
-          <w:rFonts w:ascii="Times New Roman" w:cs="Times New Roman" w:eastAsia="Times New Roman" w:hAnsi="Times New Roman"/>
-          <w:sz w:val="24"/>
-          <w:szCs w:val="24"/>
-          <w:rtl w:val="0"/>
-        </w:rPr>
-        <w:t xml:space="preserve">:  Git,  Jira,  Bash,  PowerShell,  Claude Code,  Copilot</w:t>
-      </w:r>
-    </w:p>
-    <w:p>
-      <w:pPr>
-        <w:spacing w:line="240" w:lineRule="auto"/>
-        <w:ind w:right="360"/>
-        <w:rPr>
-          <w:rFonts w:ascii="Times New Roman" w:cs="Times New Roman" w:eastAsia="Times New Roman" w:hAnsi="Times New Roman"/>
-          <w:sz w:val="24"/>
-          <w:szCs w:val="24"/>
+        <w:ind w:right="0"/>
+        <w:rPr>
+          <w:rFonts w:ascii="Times New Roman" w:cs="Times New Roman" w:eastAsia="Times New Roman" w:hAnsi="Times New Roman"/>
+        </w:rPr>
+      </w:pPr>
+      <w:r>
+        <w:rPr>
+          <w:rFonts w:ascii="Times New Roman" w:cs="Times New Roman" w:eastAsia="Times New Roman" w:hAnsi="Times New Roman"/>
+          <w:b w:val="1"/>
+          <w:bCs w:val="1"/>
+          <w:rtl w:val="0"/>
+        </w:rPr>
+        <w:t xml:space="preserve">Languages:  </w:t>
+      </w:r>
+      <w:r>
+        <w:rPr>
+          <w:rFonts w:ascii="Times New Roman" w:cs="Times New Roman" w:eastAsia="Times New Roman" w:hAnsi="Times New Roman"/>
+          <w:rtl w:val="0"/>
+        </w:rPr>
+        <w:t xml:space="preserve">C#,  Java,  JavaScript/TypeScript,  C/C++</w:t>
+      </w:r>
+      <w:r>
+        <w:rPr>
+          <w:rtl w:val="0"/>
+        </w:rPr>
+      </w:r>
+    </w:p>
+    <w:p>
+      <w:pPr>
+        <w:spacing w:line="288" w:lineRule="auto"/>
+        <w:ind w:right="0"/>
+        <w:rPr>
+          <w:rFonts w:ascii="Times New Roman" w:cs="Times New Roman" w:eastAsia="Times New Roman" w:hAnsi="Times New Roman"/>
+        </w:rPr>
+      </w:pPr>
+      <w:r>
+        <w:rPr>
+          <w:rtl w:val="0"/>
+        </w:rPr>
+      </w:r>
+    </w:p>
+    <w:p>
+      <w:pPr>
+        <w:spacing w:line="240" w:lineRule="auto"/>
+        <w:ind w:right="0"/>
+        <w:rPr>
+          <w:rFonts w:ascii="Times New Roman" w:cs="Times New Roman" w:eastAsia="Times New Roman" w:hAnsi="Times New Roman"/>
+        </w:rPr>
+      </w:pPr>
+      <w:r>
+        <w:rPr>
+          <w:rFonts w:ascii="Times New Roman" w:cs="Times New Roman" w:eastAsia="Times New Roman" w:hAnsi="Times New Roman"/>
+          <w:b w:val="1"/>
+          <w:bCs w:val="1"/>
+          <w:rtl w:val="0"/>
+        </w:rPr>
+        <w:t xml:space="preserve">Full-Stack Software Engineer </w:t>
+      </w:r>
+      <w:r>
+        <w:rPr>
+          <w:rFonts w:ascii="Times New Roman" w:cs="Times New Roman" w:eastAsia="Times New Roman" w:hAnsi="Times New Roman"/>
+          <w:rtl w:val="0"/>
+        </w:rPr>
+        <w:t xml:space="preserve">with 5+ years of experience</w:t>
+      </w:r>
+      <w:r>
+        <w:rPr>
+          <w:rFonts w:ascii="Times New Roman" w:cs="Times New Roman" w:eastAsia="Times New Roman" w:hAnsi="Times New Roman"/>
+          <w:rtl w:val="0"/>
+        </w:rPr>
+        <w:t xml:space="preserve"> designing and delivering scalable web applications. Proven track record of owning end-to-end feature development from responsive React frontends to high-performance backend APIs and cloud infrastructure.</w:t>
+      </w:r>
+    </w:p>
+    <w:p>
+      <w:pPr>
+        <w:spacing w:line="288" w:lineRule="auto"/>
+        <w:ind w:right="0"/>
+        <w:rPr>
+          <w:rFonts w:ascii="Times New Roman" w:cs="Times New Roman" w:eastAsia="Times New Roman" w:hAnsi="Times New Roman"/>
         </w:rPr>
       </w:pPr>
       <w:r>
@@ -380,14 +386,14 @@
           <w:bottom w:color="0b5394" w:space="2" w:sz="8" w:val="single"/>
         </w:pBdr>
         <w:spacing w:line="240" w:lineRule="auto"/>
-        <w:ind w:right="360"/>
+        <w:ind w:right="0"/>
         <w:rPr>
           <w:rFonts w:ascii="Times New Roman" w:cs="Times New Roman" w:eastAsia="Times New Roman" w:hAnsi="Times New Roman"/>
           <w:b w:val="1"/>
           <w:bCs w:val="1"/>
           <w:color w:val="0b5394"/>
-          <w:sz w:val="32"/>
-          <w:szCs w:val="32"/>
+          <w:sz w:val="28"/>
+          <w:szCs w:val="28"/>
         </w:rPr>
       </w:pPr>
       <w:r>
@@ -396,8 +402,8 @@
           <w:b w:val="1"/>
           <w:bCs w:val="1"/>
           <w:color w:val="0b5394"/>
-          <w:sz w:val="32"/>
-          <w:szCs w:val="32"/>
+          <w:sz w:val="28"/>
+          <w:szCs w:val="28"/>
           <w:rtl w:val="0"/>
         </w:rPr>
         <w:t xml:space="preserve">Professional Experience</w:t>
@@ -406,38 +412,32 @@
     <w:p>
       <w:pPr>
         <w:spacing w:line="240" w:lineRule="auto"/>
-        <w:ind w:right="360"/>
-        <w:rPr>
-          <w:rFonts w:ascii="Times New Roman" w:cs="Times New Roman" w:eastAsia="Times New Roman" w:hAnsi="Times New Roman"/>
-          <w:sz w:val="24"/>
-          <w:szCs w:val="24"/>
-        </w:rPr>
-      </w:pPr>
-      <w:r>
-        <w:rPr>
-          <w:rtl w:val="0"/>
-        </w:rPr>
-      </w:r>
-    </w:p>
-    <w:p>
-      <w:pPr>
-        <w:spacing w:line="240" w:lineRule="auto"/>
-        <w:ind w:right="360"/>
-        <w:rPr>
-          <w:rFonts w:ascii="Times New Roman" w:cs="Times New Roman" w:eastAsia="Times New Roman" w:hAnsi="Times New Roman"/>
-          <w:b w:val="1"/>
-          <w:bCs w:val="1"/>
-          <w:sz w:val="24"/>
-          <w:szCs w:val="24"/>
-        </w:rPr>
-      </w:pPr>
-      <w:r>
-        <w:rPr>
-          <w:rFonts w:ascii="Times New Roman" w:cs="Times New Roman" w:eastAsia="Times New Roman" w:hAnsi="Times New Roman"/>
-          <w:b w:val="1"/>
-          <w:bCs w:val="1"/>
-          <w:sz w:val="24"/>
-          <w:szCs w:val="24"/>
+        <w:ind w:right="0"/>
+        <w:rPr>
+          <w:rFonts w:ascii="Times New Roman" w:cs="Times New Roman" w:eastAsia="Times New Roman" w:hAnsi="Times New Roman"/>
+        </w:rPr>
+      </w:pPr>
+      <w:r>
+        <w:rPr>
+          <w:rtl w:val="0"/>
+        </w:rPr>
+      </w:r>
+    </w:p>
+    <w:p>
+      <w:pPr>
+        <w:spacing w:line="240" w:lineRule="auto"/>
+        <w:ind w:right="0"/>
+        <w:rPr>
+          <w:rFonts w:ascii="Times New Roman" w:cs="Times New Roman" w:eastAsia="Times New Roman" w:hAnsi="Times New Roman"/>
+          <w:b w:val="1"/>
+          <w:bCs w:val="1"/>
+        </w:rPr>
+      </w:pPr>
+      <w:r>
+        <w:rPr>
+          <w:rFonts w:ascii="Times New Roman" w:cs="Times New Roman" w:eastAsia="Times New Roman" w:hAnsi="Times New Roman"/>
+          <w:b w:val="1"/>
+          <w:bCs w:val="1"/>
           <w:rtl w:val="0"/>
         </w:rPr>
         <w:t xml:space="preserve">Caregiving </w:t>
@@ -450,13 +450,11 @@
           <w:tab w:val="right" w:leader="none" w:pos="9360"/>
         </w:tabs>
         <w:spacing w:line="240" w:lineRule="auto"/>
-        <w:ind w:right="360"/>
+        <w:ind w:right="0"/>
         <w:rPr>
           <w:rFonts w:ascii="Times New Roman" w:cs="Times New Roman" w:eastAsia="Times New Roman" w:hAnsi="Times New Roman"/>
           <w:i w:val="1"/>
           <w:iCs w:val="1"/>
-          <w:sz w:val="24"/>
-          <w:szCs w:val="24"/>
         </w:rPr>
       </w:pPr>
       <w:r>
@@ -464,8 +462,6 @@
           <w:rFonts w:ascii="Times New Roman" w:cs="Times New Roman" w:eastAsia="Times New Roman" w:hAnsi="Times New Roman"/>
           <w:i w:val="1"/>
           <w:iCs w:val="1"/>
-          <w:sz w:val="24"/>
-          <w:szCs w:val="24"/>
           <w:rtl w:val="0"/>
         </w:rPr>
         <w:t xml:space="preserve">Career Break </w:t>
@@ -479,13 +475,11 @@
           <w:tab w:val="right" w:leader="none" w:pos="9360"/>
         </w:tabs>
         <w:spacing w:line="240" w:lineRule="auto"/>
-        <w:ind w:right="360"/>
+        <w:ind w:right="0"/>
         <w:rPr>
           <w:rFonts w:ascii="Times New Roman" w:cs="Times New Roman" w:eastAsia="Times New Roman" w:hAnsi="Times New Roman"/>
           <w:i w:val="1"/>
           <w:iCs w:val="1"/>
-          <w:sz w:val="24"/>
-          <w:szCs w:val="24"/>
         </w:rPr>
       </w:pPr>
       <w:r>
@@ -500,58 +494,64 @@
           <w:tab w:val="right" w:leader="none" w:pos="9360"/>
         </w:tabs>
         <w:spacing w:line="240" w:lineRule="auto"/>
-        <w:ind w:right="360"/>
-        <w:rPr>
-          <w:rFonts w:ascii="Times New Roman" w:cs="Times New Roman" w:eastAsia="Times New Roman" w:hAnsi="Times New Roman"/>
-          <w:sz w:val="24"/>
-          <w:szCs w:val="24"/>
-        </w:rPr>
-      </w:pPr>
-      <w:r>
-        <w:rPr>
-          <w:rFonts w:ascii="Times New Roman" w:cs="Times New Roman" w:eastAsia="Times New Roman" w:hAnsi="Times New Roman"/>
-          <w:sz w:val="24"/>
-          <w:szCs w:val="24"/>
-          <w:rtl w:val="0"/>
-        </w:rPr>
-        <w:t xml:space="preserve">Stepped away from professional responsibilities to provide full-time care for a terminally ill family member; now fully available and focused on returning to a full-time engineering role.</w:t>
-      </w:r>
-    </w:p>
-    <w:p>
-      <w:pPr>
-        <w:spacing w:line="240" w:lineRule="auto"/>
-        <w:ind w:right="360"/>
-        <w:rPr>
-          <w:rFonts w:ascii="Times New Roman" w:cs="Times New Roman" w:eastAsia="Times New Roman" w:hAnsi="Times New Roman"/>
-          <w:sz w:val="24"/>
-          <w:szCs w:val="24"/>
-        </w:rPr>
-      </w:pPr>
-      <w:r>
-        <w:rPr>
-          <w:rtl w:val="0"/>
-        </w:rPr>
-      </w:r>
-    </w:p>
-    <w:p>
-      <w:pPr>
-        <w:spacing w:line="240" w:lineRule="auto"/>
-        <w:ind w:right="360"/>
-        <w:rPr>
-          <w:rFonts w:ascii="Times New Roman" w:cs="Times New Roman" w:eastAsia="Times New Roman" w:hAnsi="Times New Roman"/>
-          <w:b w:val="1"/>
-          <w:bCs w:val="1"/>
-          <w:sz w:val="24"/>
-          <w:szCs w:val="24"/>
-        </w:rPr>
-      </w:pPr>
-      <w:r>
-        <w:rPr>
-          <w:rFonts w:ascii="Times New Roman" w:cs="Times New Roman" w:eastAsia="Times New Roman" w:hAnsi="Times New Roman"/>
-          <w:b w:val="1"/>
-          <w:bCs w:val="1"/>
-          <w:sz w:val="24"/>
-          <w:szCs w:val="24"/>
+        <w:ind w:right="0"/>
+        <w:rPr>
+          <w:rFonts w:ascii="Times New Roman" w:cs="Times New Roman" w:eastAsia="Times New Roman" w:hAnsi="Times New Roman"/>
+        </w:rPr>
+      </w:pPr>
+      <w:r>
+        <w:rPr>
+          <w:rFonts w:ascii="Times New Roman" w:cs="Times New Roman" w:eastAsia="Times New Roman" w:hAnsi="Times New Roman"/>
+          <w:rtl w:val="0"/>
+        </w:rPr>
+        <w:t xml:space="preserve">Stepped away from professional responsibilities to provide </w:t>
+      </w:r>
+      <w:r>
+        <w:rPr>
+          <w:rFonts w:ascii="Times New Roman" w:cs="Times New Roman" w:eastAsia="Times New Roman" w:hAnsi="Times New Roman"/>
+          <w:b w:val="1"/>
+          <w:bCs w:val="1"/>
+          <w:rtl w:val="0"/>
+        </w:rPr>
+        <w:t xml:space="preserve">full-time care for a terminally ill family member</w:t>
+      </w:r>
+      <w:r>
+        <w:rPr>
+          <w:rFonts w:ascii="Times New Roman" w:cs="Times New Roman" w:eastAsia="Times New Roman" w:hAnsi="Times New Roman"/>
+          <w:rtl w:val="0"/>
+        </w:rPr>
+        <w:t xml:space="preserve">; now fully available and focused on returning to a full-time engineering role.</w:t>
+      </w:r>
+    </w:p>
+    <w:p>
+      <w:pPr>
+        <w:spacing w:line="240" w:lineRule="auto"/>
+        <w:ind w:right="0"/>
+        <w:rPr>
+          <w:rFonts w:ascii="Times New Roman" w:cs="Times New Roman" w:eastAsia="Times New Roman" w:hAnsi="Times New Roman"/>
+        </w:rPr>
+      </w:pPr>
+      <w:r>
+        <w:rPr>
+          <w:rtl w:val="0"/>
+        </w:rPr>
+      </w:r>
+    </w:p>
+    <w:p>
+      <w:pPr>
+        <w:spacing w:line="240" w:lineRule="auto"/>
+        <w:ind w:right="0"/>
+        <w:rPr>
+          <w:rFonts w:ascii="Times New Roman" w:cs="Times New Roman" w:eastAsia="Times New Roman" w:hAnsi="Times New Roman"/>
+          <w:b w:val="1"/>
+          <w:bCs w:val="1"/>
+        </w:rPr>
+      </w:pPr>
+      <w:r>
+        <w:rPr>
+          <w:rFonts w:ascii="Times New Roman" w:cs="Times New Roman" w:eastAsia="Times New Roman" w:hAnsi="Times New Roman"/>
+          <w:b w:val="1"/>
+          <w:bCs w:val="1"/>
           <w:rtl w:val="0"/>
         </w:rPr>
         <w:t xml:space="preserve">Software Engineer III</w:t>
@@ -563,13 +563,11 @@
           <w:tab w:val="right" w:leader="none" w:pos="9360"/>
         </w:tabs>
         <w:spacing w:line="240" w:lineRule="auto"/>
-        <w:ind w:right="360"/>
+        <w:ind w:right="0"/>
         <w:rPr>
           <w:rFonts w:ascii="Times New Roman" w:cs="Times New Roman" w:eastAsia="Times New Roman" w:hAnsi="Times New Roman"/>
           <w:i w:val="1"/>
           <w:iCs w:val="1"/>
-          <w:sz w:val="24"/>
-          <w:szCs w:val="24"/>
         </w:rPr>
       </w:pPr>
       <w:r>
@@ -577,8 +575,6 @@
           <w:rFonts w:ascii="Times New Roman" w:cs="Times New Roman" w:eastAsia="Times New Roman" w:hAnsi="Times New Roman"/>
           <w:i w:val="1"/>
           <w:iCs w:val="1"/>
-          <w:sz w:val="24"/>
-          <w:szCs w:val="24"/>
           <w:rtl w:val="0"/>
         </w:rPr>
         <w:t xml:space="preserve">RDA - Baltimore, MD, USA </w:t>
@@ -589,49 +585,41 @@
     <w:p>
       <w:pPr>
         <w:spacing w:line="240" w:lineRule="auto"/>
-        <w:ind w:right="360"/>
-        <w:rPr>
-          <w:rFonts w:ascii="Times New Roman" w:cs="Times New Roman" w:eastAsia="Times New Roman" w:hAnsi="Times New Roman"/>
-          <w:b w:val="1"/>
-          <w:bCs w:val="1"/>
-          <w:sz w:val="24"/>
-          <w:szCs w:val="24"/>
-        </w:rPr>
-      </w:pPr>
-      <w:r>
-        <w:rPr>
-          <w:rtl w:val="0"/>
-        </w:rPr>
-      </w:r>
-    </w:p>
-    <w:p>
-      <w:pPr>
-        <w:spacing w:line="240" w:lineRule="auto"/>
-        <w:ind w:right="360"/>
-        <w:rPr>
-          <w:rFonts w:ascii="Times New Roman" w:cs="Times New Roman" w:eastAsia="Times New Roman" w:hAnsi="Times New Roman"/>
-          <w:sz w:val="24"/>
-          <w:szCs w:val="24"/>
-        </w:rPr>
-      </w:pPr>
-      <w:r>
-        <w:rPr>
-          <w:rFonts w:ascii="Cardo" w:cs="Cardo" w:eastAsia="Cardo" w:hAnsi="Cardo"/>
-          <w:sz w:val="24"/>
-          <w:szCs w:val="24"/>
-          <w:rtl w:val="0"/>
-        </w:rPr>
-        <w:t xml:space="preserve">Promoted from Software Engineer I → Software Engineer II → Software Engineer III based on performance and technical impact.</w:t>
-      </w:r>
-    </w:p>
-    <w:p>
-      <w:pPr>
-        <w:spacing w:line="240" w:lineRule="auto"/>
-        <w:ind w:right="360"/>
-        <w:rPr>
-          <w:rFonts w:ascii="Times New Roman" w:cs="Times New Roman" w:eastAsia="Times New Roman" w:hAnsi="Times New Roman"/>
-          <w:sz w:val="24"/>
-          <w:szCs w:val="24"/>
+        <w:ind w:right="0"/>
+        <w:rPr>
+          <w:rFonts w:ascii="Times New Roman" w:cs="Times New Roman" w:eastAsia="Times New Roman" w:hAnsi="Times New Roman"/>
+          <w:b w:val="1"/>
+          <w:bCs w:val="1"/>
+        </w:rPr>
+      </w:pPr>
+      <w:r>
+        <w:rPr>
+          <w:rtl w:val="0"/>
+        </w:rPr>
+      </w:r>
+    </w:p>
+    <w:p>
+      <w:pPr>
+        <w:spacing w:line="240" w:lineRule="auto"/>
+        <w:ind w:right="0"/>
+        <w:rPr>
+          <w:rFonts w:ascii="Times New Roman" w:cs="Times New Roman" w:eastAsia="Times New Roman" w:hAnsi="Times New Roman"/>
+        </w:rPr>
+      </w:pPr>
+      <w:r>
+        <w:rPr>
+          <w:rFonts w:ascii="Times New Roman" w:cs="Times New Roman" w:eastAsia="Times New Roman" w:hAnsi="Times New Roman"/>
+          <w:rtl w:val="0"/>
+        </w:rPr>
+        <w:t xml:space="preserve">Promoted from Software Engineer I to Software Engineer II and Software Engineer III based on performance and technical impact. Delivered full-stack solutions across enterprise, government, and higher education clients as a software consultant.</w:t>
+      </w:r>
+    </w:p>
+    <w:p>
+      <w:pPr>
+        <w:spacing w:line="240" w:lineRule="auto"/>
+        <w:ind w:left="0" w:right="0" w:firstLine="0"/>
+        <w:rPr>
+          <w:rFonts w:ascii="Times New Roman" w:cs="Times New Roman" w:eastAsia="Times New Roman" w:hAnsi="Times New Roman"/>
         </w:rPr>
       </w:pPr>
       <w:r>
@@ -647,39 +635,33 @@
           <w:numId w:val="4"/>
         </w:numPr>
         <w:spacing w:line="240" w:lineRule="auto"/>
-        <w:ind w:left="720" w:right="360" w:hanging="360"/>
-        <w:rPr>
-          <w:rFonts w:ascii="Times New Roman" w:cs="Times New Roman" w:eastAsia="Times New Roman" w:hAnsi="Times New Roman"/>
-          <w:sz w:val="24"/>
-          <w:szCs w:val="24"/>
-        </w:rPr>
-      </w:pPr>
-      <w:r>
-        <w:rPr>
-          <w:rFonts w:ascii="Times New Roman" w:cs="Times New Roman" w:eastAsia="Times New Roman" w:hAnsi="Times New Roman"/>
-          <w:sz w:val="24"/>
-          <w:szCs w:val="24"/>
-          <w:rtl w:val="0"/>
-        </w:rPr>
-        <w:t xml:space="preserve">Implemented and operated a variety of backend infrastructure supporting enterprise, eCommerce, and high-traffic public applications serving millions of users; using both </w:t>
-      </w:r>
-      <w:r>
-        <w:rPr>
-          <w:rFonts w:ascii="Times New Roman" w:cs="Times New Roman" w:eastAsia="Times New Roman" w:hAnsi="Times New Roman"/>
-          <w:sz w:val="24"/>
-          <w:szCs w:val="24"/>
-          <w:rtl w:val="0"/>
-        </w:rPr>
-        <w:t xml:space="preserve">ASP.NET</w:t>
-      </w:r>
-      <w:r>
-        <w:rPr>
-          <w:rFonts w:ascii="Times New Roman" w:cs="Times New Roman" w:eastAsia="Times New Roman" w:hAnsi="Times New Roman"/>
-          <w:sz w:val="24"/>
-          <w:szCs w:val="24"/>
-          <w:rtl w:val="0"/>
-        </w:rPr>
-        <w:t xml:space="preserve"> and Node.js</w:t>
+        <w:ind w:left="720" w:right="0" w:hanging="360"/>
+        <w:rPr>
+          <w:rFonts w:ascii="Times New Roman" w:cs="Times New Roman" w:eastAsia="Times New Roman" w:hAnsi="Times New Roman"/>
+        </w:rPr>
+      </w:pPr>
+      <w:r>
+        <w:rPr>
+          <w:rFonts w:ascii="Times New Roman" w:cs="Times New Roman" w:eastAsia="Times New Roman" w:hAnsi="Times New Roman"/>
+          <w:rtl w:val="0"/>
+        </w:rPr>
+        <w:t xml:space="preserve">Led and delivered </w:t>
+      </w:r>
+      <w:r>
+        <w:rPr>
+          <w:rFonts w:ascii="Times New Roman" w:cs="Times New Roman" w:eastAsia="Times New Roman" w:hAnsi="Times New Roman"/>
+          <w:b w:val="1"/>
+          <w:bCs w:val="1"/>
+          <w:rtl w:val="0"/>
+        </w:rPr>
+        <w:t xml:space="preserve">end-to-end feature development</w:t>
+      </w:r>
+      <w:r>
+        <w:rPr>
+          <w:rFonts w:ascii="Times New Roman" w:cs="Times New Roman" w:eastAsia="Times New Roman" w:hAnsi="Times New Roman"/>
+          <w:rtl w:val="0"/>
+        </w:rPr>
+        <w:t xml:space="preserve">, spanning React.js frontends, ASP.NET/Node.js back-ends, and cloud infrastructure</w:t>
       </w:r>
     </w:p>
     <w:p>
@@ -689,21 +671,33 @@
           <w:numId w:val="4"/>
         </w:numPr>
         <w:spacing w:line="240" w:lineRule="auto"/>
-        <w:ind w:left="720" w:right="360" w:hanging="360"/>
-        <w:rPr>
-          <w:rFonts w:ascii="Times New Roman" w:cs="Times New Roman" w:eastAsia="Times New Roman" w:hAnsi="Times New Roman"/>
-          <w:sz w:val="24"/>
-          <w:szCs w:val="24"/>
-        </w:rPr>
-      </w:pPr>
-      <w:r>
-        <w:rPr>
-          <w:rFonts w:ascii="Times New Roman" w:cs="Times New Roman" w:eastAsia="Times New Roman" w:hAnsi="Times New Roman"/>
-          <w:sz w:val="24"/>
-          <w:szCs w:val="24"/>
-          <w:rtl w:val="0"/>
-        </w:rPr>
-        <w:t xml:space="preserve">Designed and built data integration and aggregation layers for internal and 3rd party backend services (Sitecore CMS, SAP, Shopify, Google Analytics) improving request response times and extending functionality</w:t>
+        <w:ind w:left="720" w:right="0" w:hanging="360"/>
+        <w:rPr>
+          <w:rFonts w:ascii="Times New Roman" w:cs="Times New Roman" w:eastAsia="Times New Roman" w:hAnsi="Times New Roman"/>
+        </w:rPr>
+      </w:pPr>
+      <w:r>
+        <w:rPr>
+          <w:rFonts w:ascii="Times New Roman" w:cs="Times New Roman" w:eastAsia="Times New Roman" w:hAnsi="Times New Roman"/>
+          <w:rtl w:val="0"/>
+        </w:rPr>
+        <w:t xml:space="preserve">Designed and implemented </w:t>
+      </w:r>
+      <w:r>
+        <w:rPr>
+          <w:rFonts w:ascii="Times New Roman" w:cs="Times New Roman" w:eastAsia="Times New Roman" w:hAnsi="Times New Roman"/>
+          <w:b w:val="1"/>
+          <w:bCs w:val="1"/>
+          <w:rtl w:val="0"/>
+        </w:rPr>
+        <w:t xml:space="preserve">scalable REST APIs</w:t>
+      </w:r>
+      <w:r>
+        <w:rPr>
+          <w:rFonts w:ascii="Times New Roman" w:cs="Times New Roman" w:eastAsia="Times New Roman" w:hAnsi="Times New Roman"/>
+          <w:rtl w:val="0"/>
+        </w:rPr>
+        <w:t xml:space="preserve"> supporting high-traffic applications serving millions of monthly users</w:t>
       </w:r>
     </w:p>
     <w:p>
@@ -713,21 +707,33 @@
           <w:numId w:val="4"/>
         </w:numPr>
         <w:spacing w:line="240" w:lineRule="auto"/>
-        <w:ind w:left="720" w:right="360" w:hanging="360"/>
-        <w:rPr>
-          <w:rFonts w:ascii="Times New Roman" w:cs="Times New Roman" w:eastAsia="Times New Roman" w:hAnsi="Times New Roman"/>
-          <w:sz w:val="24"/>
-          <w:szCs w:val="24"/>
-        </w:rPr>
-      </w:pPr>
-      <w:r>
-        <w:rPr>
-          <w:rFonts w:ascii="Times New Roman" w:cs="Times New Roman" w:eastAsia="Times New Roman" w:hAnsi="Times New Roman"/>
-          <w:sz w:val="24"/>
-          <w:szCs w:val="24"/>
-          <w:rtl w:val="0"/>
-        </w:rPr>
-        <w:t xml:space="preserve">Automated cloud infrastructure provisioning using IaC (Terraform and Packer), improving deployment consistency and reducing environmental configuration drift</w:t>
+        <w:ind w:left="720" w:right="0" w:hanging="360"/>
+        <w:rPr>
+          <w:rFonts w:ascii="Times New Roman" w:cs="Times New Roman" w:eastAsia="Times New Roman" w:hAnsi="Times New Roman"/>
+        </w:rPr>
+      </w:pPr>
+      <w:r>
+        <w:rPr>
+          <w:rFonts w:ascii="Times New Roman" w:cs="Times New Roman" w:eastAsia="Times New Roman" w:hAnsi="Times New Roman"/>
+          <w:rtl w:val="0"/>
+        </w:rPr>
+        <w:t xml:space="preserve">Built </w:t>
+      </w:r>
+      <w:r>
+        <w:rPr>
+          <w:rFonts w:ascii="Times New Roman" w:cs="Times New Roman" w:eastAsia="Times New Roman" w:hAnsi="Times New Roman"/>
+          <w:b w:val="1"/>
+          <w:bCs w:val="1"/>
+          <w:rtl w:val="0"/>
+        </w:rPr>
+        <w:t xml:space="preserve">modern frontend architectures</w:t>
+      </w:r>
+      <w:r>
+        <w:rPr>
+          <w:rFonts w:ascii="Times New Roman" w:cs="Times New Roman" w:eastAsia="Times New Roman" w:hAnsi="Times New Roman"/>
+          <w:rtl w:val="0"/>
+        </w:rPr>
+        <w:t xml:space="preserve"> using React and Next.js, implementing SSR/CSR strategies to optimize performance and user experience</w:t>
       </w:r>
     </w:p>
     <w:p>
@@ -737,21 +743,33 @@
           <w:numId w:val="4"/>
         </w:numPr>
         <w:spacing w:line="240" w:lineRule="auto"/>
-        <w:ind w:left="720" w:right="360" w:hanging="360"/>
-        <w:rPr>
-          <w:rFonts w:ascii="Times New Roman" w:cs="Times New Roman" w:eastAsia="Times New Roman" w:hAnsi="Times New Roman"/>
-          <w:sz w:val="24"/>
-          <w:szCs w:val="24"/>
-        </w:rPr>
-      </w:pPr>
-      <w:r>
-        <w:rPr>
-          <w:rFonts w:ascii="Times New Roman" w:cs="Times New Roman" w:eastAsia="Times New Roman" w:hAnsi="Times New Roman"/>
-          <w:sz w:val="24"/>
-          <w:szCs w:val="24"/>
-          <w:rtl w:val="0"/>
-        </w:rPr>
-        <w:t xml:space="preserve">Containerized backend services with Docker to standardize runtime environments and improve reliability across development and production systems</w:t>
+        <w:ind w:left="720" w:right="0" w:hanging="360"/>
+        <w:rPr>
+          <w:rFonts w:ascii="Times New Roman" w:cs="Times New Roman" w:eastAsia="Times New Roman" w:hAnsi="Times New Roman"/>
+        </w:rPr>
+      </w:pPr>
+      <w:r>
+        <w:rPr>
+          <w:rFonts w:ascii="Times New Roman" w:cs="Times New Roman" w:eastAsia="Times New Roman" w:hAnsi="Times New Roman"/>
+          <w:rtl w:val="0"/>
+        </w:rPr>
+        <w:t xml:space="preserve">Developed and optimized </w:t>
+      </w:r>
+      <w:r>
+        <w:rPr>
+          <w:rFonts w:ascii="Times New Roman" w:cs="Times New Roman" w:eastAsia="Times New Roman" w:hAnsi="Times New Roman"/>
+          <w:b w:val="1"/>
+          <w:bCs w:val="1"/>
+          <w:rtl w:val="0"/>
+        </w:rPr>
+        <w:t xml:space="preserve">CI/CD pipelines</w:t>
+      </w:r>
+      <w:r>
+        <w:rPr>
+          <w:rFonts w:ascii="Times New Roman" w:cs="Times New Roman" w:eastAsia="Times New Roman" w:hAnsi="Times New Roman"/>
+          <w:rtl w:val="0"/>
+        </w:rPr>
+        <w:t xml:space="preserve">, decreasing time to deploy and increasing release reliability across environments</w:t>
       </w:r>
     </w:p>
     <w:p>
@@ -761,21 +779,33 @@
           <w:numId w:val="4"/>
         </w:numPr>
         <w:spacing w:line="240" w:lineRule="auto"/>
-        <w:ind w:left="720" w:right="360" w:hanging="360"/>
-        <w:rPr>
-          <w:rFonts w:ascii="Times New Roman" w:cs="Times New Roman" w:eastAsia="Times New Roman" w:hAnsi="Times New Roman"/>
-          <w:sz w:val="24"/>
-          <w:szCs w:val="24"/>
-        </w:rPr>
-      </w:pPr>
-      <w:r>
-        <w:rPr>
-          <w:rFonts w:ascii="Times New Roman" w:cs="Times New Roman" w:eastAsia="Times New Roman" w:hAnsi="Times New Roman"/>
-          <w:sz w:val="24"/>
-          <w:szCs w:val="24"/>
-          <w:rtl w:val="0"/>
-        </w:rPr>
-        <w:t xml:space="preserve">Provided production engineering support through root-cause analysis across distributed integrations and backend services</w:t>
+        <w:ind w:left="720" w:right="0" w:hanging="360"/>
+        <w:rPr>
+          <w:rFonts w:ascii="Times New Roman" w:cs="Times New Roman" w:eastAsia="Times New Roman" w:hAnsi="Times New Roman"/>
+        </w:rPr>
+      </w:pPr>
+      <w:r>
+        <w:rPr>
+          <w:rFonts w:ascii="Times New Roman" w:cs="Times New Roman" w:eastAsia="Times New Roman" w:hAnsi="Times New Roman"/>
+          <w:rtl w:val="0"/>
+        </w:rPr>
+        <w:t xml:space="preserve">Automated infrastructure provisioning using </w:t>
+      </w:r>
+      <w:r>
+        <w:rPr>
+          <w:rFonts w:ascii="Times New Roman" w:cs="Times New Roman" w:eastAsia="Times New Roman" w:hAnsi="Times New Roman"/>
+          <w:b w:val="1"/>
+          <w:bCs w:val="1"/>
+          <w:rtl w:val="0"/>
+        </w:rPr>
+        <w:t xml:space="preserve">Terraform and Docker</w:t>
+      </w:r>
+      <w:r>
+        <w:rPr>
+          <w:rFonts w:ascii="Times New Roman" w:cs="Times New Roman" w:eastAsia="Times New Roman" w:hAnsi="Times New Roman"/>
+          <w:rtl w:val="0"/>
+        </w:rPr>
+        <w:t xml:space="preserve">, improving environment consistency and developer onboarding speed</w:t>
       </w:r>
     </w:p>
     <w:p>
@@ -785,21 +815,33 @@
           <w:numId w:val="4"/>
         </w:numPr>
         <w:spacing w:line="240" w:lineRule="auto"/>
-        <w:ind w:left="720" w:right="360" w:hanging="360"/>
-        <w:rPr>
-          <w:rFonts w:ascii="Times New Roman" w:cs="Times New Roman" w:eastAsia="Times New Roman" w:hAnsi="Times New Roman"/>
-          <w:sz w:val="24"/>
-          <w:szCs w:val="24"/>
-        </w:rPr>
-      </w:pPr>
-      <w:r>
-        <w:rPr>
-          <w:rFonts w:ascii="Times New Roman" w:cs="Times New Roman" w:eastAsia="Times New Roman" w:hAnsi="Times New Roman"/>
-          <w:sz w:val="24"/>
-          <w:szCs w:val="24"/>
-          <w:rtl w:val="0"/>
-        </w:rPr>
-        <w:t xml:space="preserve">Contributed in system design discussions, code reviews, and architecture improvements focused on reliability, and long-term maintainability</w:t>
+        <w:ind w:left="720" w:right="0" w:hanging="360"/>
+        <w:rPr>
+          <w:rFonts w:ascii="Times New Roman" w:cs="Times New Roman" w:eastAsia="Times New Roman" w:hAnsi="Times New Roman"/>
+        </w:rPr>
+      </w:pPr>
+      <w:r>
+        <w:rPr>
+          <w:rFonts w:ascii="Times New Roman" w:cs="Times New Roman" w:eastAsia="Times New Roman" w:hAnsi="Times New Roman"/>
+          <w:rtl w:val="0"/>
+        </w:rPr>
+        <w:t xml:space="preserve">Practiced </w:t>
+      </w:r>
+      <w:r>
+        <w:rPr>
+          <w:rFonts w:ascii="Times New Roman" w:cs="Times New Roman" w:eastAsia="Times New Roman" w:hAnsi="Times New Roman"/>
+          <w:b w:val="1"/>
+          <w:bCs w:val="1"/>
+          <w:rtl w:val="0"/>
+        </w:rPr>
+        <w:t xml:space="preserve">test-driven development (TDD)</w:t>
+      </w:r>
+      <w:r>
+        <w:rPr>
+          <w:rFonts w:ascii="Times New Roman" w:cs="Times New Roman" w:eastAsia="Times New Roman" w:hAnsi="Times New Roman"/>
+          <w:rtl w:val="0"/>
+        </w:rPr>
+        <w:t xml:space="preserve"> with unit and end-to-end testing to ensure code quality and overall system reliability</w:t>
       </w:r>
     </w:p>
     <w:p>
@@ -809,109 +851,166 @@
           <w:numId w:val="4"/>
         </w:numPr>
         <w:spacing w:line="240" w:lineRule="auto"/>
-        <w:ind w:left="720" w:right="360" w:hanging="360"/>
-        <w:rPr>
-          <w:rFonts w:ascii="Times New Roman" w:cs="Times New Roman" w:eastAsia="Times New Roman" w:hAnsi="Times New Roman"/>
-          <w:sz w:val="24"/>
-          <w:szCs w:val="24"/>
-        </w:rPr>
-      </w:pPr>
-      <w:r>
-        <w:rPr>
-          <w:rFonts w:ascii="Times New Roman" w:cs="Times New Roman" w:eastAsia="Times New Roman" w:hAnsi="Times New Roman"/>
-          <w:sz w:val="24"/>
-          <w:szCs w:val="24"/>
-          <w:rtl w:val="0"/>
-        </w:rPr>
-        <w:t xml:space="preserve">Participated in Agile development processes such story-boarding, sprint planning, and post-mortems</w:t>
-      </w:r>
-    </w:p>
-    <w:p>
-      <w:pPr>
-        <w:spacing w:line="240" w:lineRule="auto"/>
-        <w:ind w:right="360"/>
-        <w:rPr>
-          <w:rFonts w:ascii="Times New Roman" w:cs="Times New Roman" w:eastAsia="Times New Roman" w:hAnsi="Times New Roman"/>
-          <w:sz w:val="24"/>
-          <w:szCs w:val="24"/>
-        </w:rPr>
-      </w:pPr>
-      <w:r>
-        <w:rPr>
-          <w:rtl w:val="0"/>
-        </w:rPr>
-      </w:r>
-    </w:p>
-    <w:p>
-      <w:pPr>
-        <w:spacing w:line="240" w:lineRule="auto"/>
-        <w:ind w:right="360"/>
-        <w:rPr>
-          <w:rFonts w:ascii="Times New Roman" w:cs="Times New Roman" w:eastAsia="Times New Roman" w:hAnsi="Times New Roman"/>
-          <w:sz w:val="24"/>
-          <w:szCs w:val="24"/>
-        </w:rPr>
-      </w:pPr>
-      <w:r>
-        <w:rPr>
-          <w:rtl w:val="0"/>
-        </w:rPr>
-      </w:r>
-    </w:p>
-    <w:p>
-      <w:pPr>
-        <w:spacing w:line="240" w:lineRule="auto"/>
-        <w:ind w:right="360"/>
-        <w:rPr>
-          <w:rFonts w:ascii="Times New Roman" w:cs="Times New Roman" w:eastAsia="Times New Roman" w:hAnsi="Times New Roman"/>
-          <w:sz w:val="24"/>
-          <w:szCs w:val="24"/>
-        </w:rPr>
-      </w:pPr>
-      <w:r>
-        <w:rPr>
-          <w:rtl w:val="0"/>
-        </w:rPr>
-      </w:r>
-    </w:p>
-    <w:p>
-      <w:pPr>
-        <w:spacing w:line="240" w:lineRule="auto"/>
-        <w:ind w:left="720" w:right="360" w:firstLine="0"/>
-        <w:rPr>
-          <w:rFonts w:ascii="Times New Roman" w:cs="Times New Roman" w:eastAsia="Times New Roman" w:hAnsi="Times New Roman"/>
-          <w:sz w:val="24"/>
-          <w:szCs w:val="24"/>
-        </w:rPr>
-      </w:pPr>
-      <w:r>
-        <w:rPr>
-          <w:rtl w:val="0"/>
-        </w:rPr>
-      </w:r>
-    </w:p>
-    <w:p>
-      <w:pPr>
-        <w:spacing w:line="240" w:lineRule="auto"/>
-        <w:ind w:right="360"/>
-        <w:rPr>
-          <w:rFonts w:ascii="Times New Roman" w:cs="Times New Roman" w:eastAsia="Times New Roman" w:hAnsi="Times New Roman"/>
-          <w:b w:val="1"/>
-          <w:bCs w:val="1"/>
-          <w:sz w:val="24"/>
-          <w:szCs w:val="24"/>
-        </w:rPr>
-      </w:pPr>
-      <w:r>
-        <w:rPr>
-          <w:rFonts w:ascii="Times New Roman" w:cs="Times New Roman" w:eastAsia="Times New Roman" w:hAnsi="Times New Roman"/>
-          <w:b w:val="1"/>
-          <w:bCs w:val="1"/>
-          <w:sz w:val="24"/>
-          <w:szCs w:val="24"/>
-          <w:rtl w:val="0"/>
-        </w:rPr>
-        <w:t xml:space="preserve">Teaching Assistant</w:t>
+        <w:ind w:left="720" w:right="0" w:hanging="360"/>
+        <w:rPr>
+          <w:rFonts w:ascii="Times New Roman" w:cs="Times New Roman" w:eastAsia="Times New Roman" w:hAnsi="Times New Roman"/>
+        </w:rPr>
+      </w:pPr>
+      <w:r>
+        <w:rPr>
+          <w:rFonts w:ascii="Times New Roman" w:cs="Times New Roman" w:eastAsia="Times New Roman" w:hAnsi="Times New Roman"/>
+          <w:b w:val="1"/>
+          <w:bCs w:val="1"/>
+          <w:rtl w:val="0"/>
+        </w:rPr>
+        <w:t xml:space="preserve">Collaborated with stakeholders, </w:t>
+      </w:r>
+      <w:r>
+        <w:rPr>
+          <w:rFonts w:ascii="Times New Roman" w:cs="Times New Roman" w:eastAsia="Times New Roman" w:hAnsi="Times New Roman"/>
+          <w:rtl w:val="0"/>
+        </w:rPr>
+        <w:t xml:space="preserve">product managers, and designers to deliver production-ready features aligned with business requirements</w:t>
+      </w:r>
+    </w:p>
+    <w:p>
+      <w:pPr>
+        <w:numPr>
+          <w:ilvl w:val="0"/>
+          <w:numId w:val="4"/>
+        </w:numPr>
+        <w:spacing w:line="240" w:lineRule="auto"/>
+        <w:ind w:left="720" w:hanging="360"/>
+        <w:rPr>
+          <w:rFonts w:ascii="Times New Roman" w:cs="Times New Roman" w:eastAsia="Times New Roman" w:hAnsi="Times New Roman"/>
+        </w:rPr>
+      </w:pPr>
+      <w:r>
+        <w:rPr>
+          <w:rFonts w:ascii="Times New Roman" w:cs="Times New Roman" w:eastAsia="Times New Roman" w:hAnsi="Times New Roman"/>
+          <w:rtl w:val="0"/>
+        </w:rPr>
+        <w:t xml:space="preserve">Contributed to </w:t>
+      </w:r>
+      <w:r>
+        <w:rPr>
+          <w:rFonts w:ascii="Times New Roman" w:cs="Times New Roman" w:eastAsia="Times New Roman" w:hAnsi="Times New Roman"/>
+          <w:b w:val="1"/>
+          <w:bCs w:val="1"/>
+          <w:rtl w:val="0"/>
+        </w:rPr>
+        <w:t xml:space="preserve">code reviews, mentorship, and release processes</w:t>
+      </w:r>
+      <w:r>
+        <w:rPr>
+          <w:rFonts w:ascii="Times New Roman" w:cs="Times New Roman" w:eastAsia="Times New Roman" w:hAnsi="Times New Roman"/>
+          <w:rtl w:val="0"/>
+        </w:rPr>
+        <w:t xml:space="preserve"> across multiple teams and projects</w:t>
+      </w:r>
+    </w:p>
+    <w:p>
+      <w:pPr>
+        <w:spacing w:line="240" w:lineRule="auto"/>
+        <w:ind w:left="0" w:right="0" w:firstLine="0"/>
+        <w:rPr>
+          <w:rFonts w:ascii="Times New Roman" w:cs="Times New Roman" w:eastAsia="Times New Roman" w:hAnsi="Times New Roman"/>
+        </w:rPr>
+      </w:pPr>
+      <w:r>
+        <w:rPr>
+          <w:rtl w:val="0"/>
+        </w:rPr>
+      </w:r>
+    </w:p>
+    <w:p>
+      <w:pPr>
+        <w:spacing w:line="240" w:lineRule="auto"/>
+        <w:ind w:left="720" w:right="0" w:firstLine="0"/>
+        <w:rPr>
+          <w:rFonts w:ascii="Times New Roman" w:cs="Times New Roman" w:eastAsia="Times New Roman" w:hAnsi="Times New Roman"/>
+        </w:rPr>
+      </w:pPr>
+      <w:r>
+        <w:rPr>
+          <w:rtl w:val="0"/>
+        </w:rPr>
+      </w:r>
+    </w:p>
+    <w:p>
+      <w:pPr>
+        <w:spacing w:line="240" w:lineRule="auto"/>
+        <w:ind w:left="720" w:right="0" w:firstLine="0"/>
+        <w:rPr>
+          <w:rFonts w:ascii="Times New Roman" w:cs="Times New Roman" w:eastAsia="Times New Roman" w:hAnsi="Times New Roman"/>
+        </w:rPr>
+      </w:pPr>
+      <w:r>
+        <w:rPr>
+          <w:rtl w:val="0"/>
+        </w:rPr>
+      </w:r>
+    </w:p>
+    <w:p>
+      <w:pPr>
+        <w:pBdr>
+          <w:bottom w:color="0b5394" w:space="2" w:sz="8" w:val="single"/>
+        </w:pBdr>
+        <w:spacing w:line="240" w:lineRule="auto"/>
+        <w:ind w:right="0"/>
+        <w:rPr>
+          <w:rFonts w:ascii="Times New Roman" w:cs="Times New Roman" w:eastAsia="Times New Roman" w:hAnsi="Times New Roman"/>
+          <w:b w:val="1"/>
+          <w:bCs w:val="1"/>
+          <w:color w:val="0b5394"/>
+          <w:sz w:val="28"/>
+          <w:szCs w:val="28"/>
+        </w:rPr>
+      </w:pPr>
+      <w:r>
+        <w:rPr>
+          <w:rFonts w:ascii="Times New Roman" w:cs="Times New Roman" w:eastAsia="Times New Roman" w:hAnsi="Times New Roman"/>
+          <w:b w:val="1"/>
+          <w:bCs w:val="1"/>
+          <w:color w:val="0b5394"/>
+          <w:sz w:val="28"/>
+          <w:szCs w:val="28"/>
+          <w:rtl w:val="0"/>
+        </w:rPr>
+        <w:t xml:space="preserve">Projects</w:t>
+      </w:r>
+    </w:p>
+    <w:p>
+      <w:pPr>
+        <w:ind w:right="0"/>
+        <w:rPr>
+          <w:rFonts w:ascii="Times New Roman" w:cs="Times New Roman" w:eastAsia="Times New Roman" w:hAnsi="Times New Roman"/>
+        </w:rPr>
+      </w:pPr>
+      <w:r>
+        <w:rPr>
+          <w:rtl w:val="0"/>
+        </w:rPr>
+      </w:r>
+    </w:p>
+    <w:p>
+      <w:pPr>
+        <w:spacing w:line="240" w:lineRule="auto"/>
+        <w:ind w:right="0"/>
+        <w:rPr>
+          <w:rFonts w:ascii="Times New Roman" w:cs="Times New Roman" w:eastAsia="Times New Roman" w:hAnsi="Times New Roman"/>
+          <w:b w:val="1"/>
+          <w:bCs w:val="1"/>
+        </w:rPr>
+      </w:pPr>
+      <w:r>
+        <w:rPr>
+          <w:rFonts w:ascii="Times New Roman" w:cs="Times New Roman" w:eastAsia="Times New Roman" w:hAnsi="Times New Roman"/>
+          <w:b w:val="1"/>
+          <w:bCs w:val="1"/>
+          <w:rtl w:val="0"/>
+        </w:rPr>
+        <w:t xml:space="preserve">Website Redesign</w:t>
       </w:r>
     </w:p>
     <w:p>
@@ -920,13 +1019,11 @@
           <w:tab w:val="right" w:leader="none" w:pos="9360"/>
         </w:tabs>
         <w:spacing w:line="240" w:lineRule="auto"/>
-        <w:ind w:right="360"/>
+        <w:ind w:right="0"/>
         <w:rPr>
           <w:rFonts w:ascii="Times New Roman" w:cs="Times New Roman" w:eastAsia="Times New Roman" w:hAnsi="Times New Roman"/>
           <w:i w:val="1"/>
           <w:iCs w:val="1"/>
-          <w:sz w:val="24"/>
-          <w:szCs w:val="24"/>
         </w:rPr>
       </w:pPr>
       <w:r>
@@ -934,25 +1031,19 @@
           <w:rFonts w:ascii="Times New Roman" w:cs="Times New Roman" w:eastAsia="Times New Roman" w:hAnsi="Times New Roman"/>
           <w:i w:val="1"/>
           <w:iCs w:val="1"/>
-          <w:sz w:val="24"/>
-          <w:szCs w:val="24"/>
-          <w:rtl w:val="0"/>
-        </w:rPr>
-        <w:t xml:space="preserve">Temple University - Philadelphia, PA, USA </w:t>
+          <w:rtl w:val="0"/>
+        </w:rPr>
+        <w:t xml:space="preserve">Michigan State University </w:t>
         <w:tab/>
-        <w:t xml:space="preserve">August 2018 – June 2019</w:t>
-      </w:r>
-    </w:p>
-    <w:p>
-      <w:pPr>
-        <w:spacing w:line="240" w:lineRule="auto"/>
-        <w:ind w:right="360"/>
-        <w:rPr>
-          <w:rFonts w:ascii="Times New Roman" w:cs="Times New Roman" w:eastAsia="Times New Roman" w:hAnsi="Times New Roman"/>
-          <w:b w:val="1"/>
-          <w:bCs w:val="1"/>
-          <w:sz w:val="24"/>
-          <w:szCs w:val="24"/>
+        <w:t xml:space="preserve">February 2024 – March 2025</w:t>
+      </w:r>
+    </w:p>
+    <w:p>
+      <w:pPr>
+        <w:spacing w:line="240" w:lineRule="auto"/>
+        <w:ind w:right="0"/>
+        <w:rPr>
+          <w:rFonts w:ascii="Times New Roman" w:cs="Times New Roman" w:eastAsia="Times New Roman" w:hAnsi="Times New Roman"/>
         </w:rPr>
       </w:pPr>
       <w:r>
@@ -968,21 +1059,26 @@
           <w:numId w:val="2"/>
         </w:numPr>
         <w:spacing w:line="240" w:lineRule="auto"/>
-        <w:ind w:left="720" w:right="360" w:hanging="360"/>
-        <w:rPr>
-          <w:rFonts w:ascii="Times New Roman" w:cs="Times New Roman" w:eastAsia="Times New Roman" w:hAnsi="Times New Roman"/>
-          <w:sz w:val="24"/>
-          <w:szCs w:val="24"/>
-        </w:rPr>
-      </w:pPr>
-      <w:r>
-        <w:rPr>
-          <w:rFonts w:ascii="Times New Roman" w:cs="Times New Roman" w:eastAsia="Times New Roman" w:hAnsi="Times New Roman"/>
-          <w:sz w:val="24"/>
-          <w:szCs w:val="24"/>
-          <w:rtl w:val="0"/>
-        </w:rPr>
-        <w:t xml:space="preserve">Supported instruction for Web Application Development and Client-Side Scripting courses, assisting students in building and debugging web applications</w:t>
+        <w:ind w:left="720" w:right="0" w:hanging="360"/>
+        <w:rPr>
+          <w:rFonts w:ascii="Times New Roman" w:cs="Times New Roman" w:eastAsia="Times New Roman" w:hAnsi="Times New Roman"/>
+        </w:rPr>
+      </w:pPr>
+      <w:r>
+        <w:rPr>
+          <w:rFonts w:ascii="Times New Roman" w:cs="Times New Roman" w:eastAsia="Times New Roman" w:hAnsi="Times New Roman"/>
+          <w:b w:val="1"/>
+          <w:bCs w:val="1"/>
+          <w:rtl w:val="0"/>
+        </w:rPr>
+        <w:t xml:space="preserve">Rebuilt a legacy ASP.NET web application</w:t>
+      </w:r>
+      <w:r>
+        <w:rPr>
+          <w:rFonts w:ascii="Times New Roman" w:cs="Times New Roman" w:eastAsia="Times New Roman" w:hAnsi="Times New Roman"/>
+          <w:rtl w:val="0"/>
+        </w:rPr>
+        <w:t xml:space="preserve"> from the ground up using Next.js and Sitecore XM Cloud, delivering full feature parity while introducing new components and improved user experience</w:t>
       </w:r>
     </w:p>
     <w:p>
@@ -992,21 +1088,33 @@
           <w:numId w:val="2"/>
         </w:numPr>
         <w:spacing w:line="240" w:lineRule="auto"/>
-        <w:ind w:left="720" w:right="360" w:hanging="360"/>
-        <w:rPr>
-          <w:rFonts w:ascii="Times New Roman" w:cs="Times New Roman" w:eastAsia="Times New Roman" w:hAnsi="Times New Roman"/>
-          <w:sz w:val="24"/>
-          <w:szCs w:val="24"/>
-        </w:rPr>
-      </w:pPr>
-      <w:r>
-        <w:rPr>
-          <w:rFonts w:ascii="Times New Roman" w:cs="Times New Roman" w:eastAsia="Times New Roman" w:hAnsi="Times New Roman"/>
-          <w:sz w:val="24"/>
-          <w:szCs w:val="24"/>
-          <w:rtl w:val="0"/>
-        </w:rPr>
-        <w:t xml:space="preserve">Mentored students on Java, JavaScript, HTML, CSS, and core software engineering concepts including debugging, code structure, and problem-solving</w:t>
+        <w:ind w:left="720" w:right="0" w:hanging="360"/>
+        <w:rPr>
+          <w:rFonts w:ascii="Times New Roman" w:cs="Times New Roman" w:eastAsia="Times New Roman" w:hAnsi="Times New Roman"/>
+        </w:rPr>
+      </w:pPr>
+      <w:r>
+        <w:rPr>
+          <w:rFonts w:ascii="Times New Roman" w:cs="Times New Roman" w:eastAsia="Times New Roman" w:hAnsi="Times New Roman"/>
+          <w:rtl w:val="0"/>
+        </w:rPr>
+        <w:t xml:space="preserve">Developed end-to-end functionality across the stack, including </w:t>
+      </w:r>
+      <w:r>
+        <w:rPr>
+          <w:rFonts w:ascii="Times New Roman" w:cs="Times New Roman" w:eastAsia="Times New Roman" w:hAnsi="Times New Roman"/>
+          <w:b w:val="1"/>
+          <w:bCs w:val="1"/>
+          <w:rtl w:val="0"/>
+        </w:rPr>
+        <w:t xml:space="preserve">React frontend components</w:t>
+      </w:r>
+      <w:r>
+        <w:rPr>
+          <w:rFonts w:ascii="Times New Roman" w:cs="Times New Roman" w:eastAsia="Times New Roman" w:hAnsi="Times New Roman"/>
+          <w:rtl w:val="0"/>
+        </w:rPr>
+        <w:t xml:space="preserve"> and RESTful APIs to support dynamic content delivery</w:t>
       </w:r>
     </w:p>
     <w:p>
@@ -1016,21 +1124,33 @@
           <w:numId w:val="2"/>
         </w:numPr>
         <w:spacing w:line="240" w:lineRule="auto"/>
-        <w:ind w:left="720" w:right="360" w:hanging="360"/>
-        <w:rPr>
-          <w:rFonts w:ascii="Times New Roman" w:cs="Times New Roman" w:eastAsia="Times New Roman" w:hAnsi="Times New Roman"/>
-          <w:sz w:val="24"/>
-          <w:szCs w:val="24"/>
-        </w:rPr>
-      </w:pPr>
-      <w:r>
-        <w:rPr>
-          <w:rFonts w:ascii="Times New Roman" w:cs="Times New Roman" w:eastAsia="Times New Roman" w:hAnsi="Times New Roman"/>
-          <w:sz w:val="24"/>
-          <w:szCs w:val="24"/>
-          <w:rtl w:val="0"/>
-        </w:rPr>
-        <w:t xml:space="preserve">Reviewed and graded programming assignments, providing detailed technical feedback to help students improve code quality and development practices</w:t>
+        <w:ind w:left="720" w:right="0" w:hanging="360"/>
+        <w:rPr>
+          <w:rFonts w:ascii="Times New Roman" w:cs="Times New Roman" w:eastAsia="Times New Roman" w:hAnsi="Times New Roman"/>
+        </w:rPr>
+      </w:pPr>
+      <w:r>
+        <w:rPr>
+          <w:rFonts w:ascii="Times New Roman" w:cs="Times New Roman" w:eastAsia="Times New Roman" w:hAnsi="Times New Roman"/>
+          <w:rtl w:val="0"/>
+        </w:rPr>
+        <w:t xml:space="preserve">Implemented </w:t>
+      </w:r>
+      <w:r>
+        <w:rPr>
+          <w:rFonts w:ascii="Times New Roman" w:cs="Times New Roman" w:eastAsia="Times New Roman" w:hAnsi="Times New Roman"/>
+          <w:b w:val="1"/>
+          <w:bCs w:val="1"/>
+          <w:rtl w:val="0"/>
+        </w:rPr>
+        <w:t xml:space="preserve">Static Site Generation (SSG)</w:t>
+      </w:r>
+      <w:r>
+        <w:rPr>
+          <w:rFonts w:ascii="Times New Roman" w:cs="Times New Roman" w:eastAsia="Times New Roman" w:hAnsi="Times New Roman"/>
+          <w:rtl w:val="0"/>
+        </w:rPr>
+        <w:t xml:space="preserve"> and modern rendering strategies to significantly improve page load performance</w:t>
       </w:r>
     </w:p>
     <w:p>
@@ -1040,103 +1160,95 @@
           <w:numId w:val="2"/>
         </w:numPr>
         <w:spacing w:line="240" w:lineRule="auto"/>
-        <w:ind w:left="720" w:right="360" w:hanging="360"/>
-        <w:rPr>
-          <w:rFonts w:ascii="Times New Roman" w:cs="Times New Roman" w:eastAsia="Times New Roman" w:hAnsi="Times New Roman"/>
-          <w:sz w:val="24"/>
-          <w:szCs w:val="24"/>
-        </w:rPr>
-      </w:pPr>
-      <w:r>
-        <w:rPr>
-          <w:rFonts w:ascii="Times New Roman" w:cs="Times New Roman" w:eastAsia="Times New Roman" w:hAnsi="Times New Roman"/>
-          <w:sz w:val="24"/>
-          <w:szCs w:val="24"/>
-          <w:rtl w:val="0"/>
-        </w:rPr>
-        <w:t xml:space="preserve">Collaborated with course instructors to refine assignments and improve project requirements and course materials</w:t>
-      </w:r>
-    </w:p>
-    <w:p>
-      <w:pPr>
-        <w:spacing w:line="240" w:lineRule="auto"/>
-        <w:ind w:right="360"/>
-        <w:rPr>
-          <w:rFonts w:ascii="Times New Roman" w:cs="Times New Roman" w:eastAsia="Times New Roman" w:hAnsi="Times New Roman"/>
-          <w:sz w:val="24"/>
-          <w:szCs w:val="24"/>
-        </w:rPr>
-      </w:pPr>
-      <w:r>
-        <w:rPr>
-          <w:rtl w:val="0"/>
-        </w:rPr>
-      </w:r>
-    </w:p>
-    <w:p>
-      <w:pPr>
-        <w:pBdr>
-          <w:bottom w:color="0b5394" w:space="2" w:sz="8" w:val="single"/>
-        </w:pBdr>
-        <w:spacing w:line="240" w:lineRule="auto"/>
-        <w:ind w:right="360"/>
-        <w:rPr>
-          <w:rFonts w:ascii="Times New Roman" w:cs="Times New Roman" w:eastAsia="Times New Roman" w:hAnsi="Times New Roman"/>
-          <w:b w:val="1"/>
-          <w:bCs w:val="1"/>
-          <w:color w:val="0b5394"/>
-          <w:sz w:val="32"/>
-          <w:szCs w:val="32"/>
-        </w:rPr>
-      </w:pPr>
-      <w:r>
-        <w:rPr>
-          <w:rFonts w:ascii="Times New Roman" w:cs="Times New Roman" w:eastAsia="Times New Roman" w:hAnsi="Times New Roman"/>
-          <w:b w:val="1"/>
-          <w:bCs w:val="1"/>
-          <w:color w:val="0b5394"/>
-          <w:sz w:val="32"/>
-          <w:szCs w:val="32"/>
-          <w:rtl w:val="0"/>
-        </w:rPr>
-        <w:t xml:space="preserve">Projects</w:t>
-      </w:r>
-    </w:p>
-    <w:p>
-      <w:pPr>
-        <w:spacing w:line="240" w:lineRule="auto"/>
-        <w:ind w:right="360"/>
-        <w:rPr>
-          <w:rFonts w:ascii="Times New Roman" w:cs="Times New Roman" w:eastAsia="Times New Roman" w:hAnsi="Times New Roman"/>
-          <w:sz w:val="20"/>
-          <w:szCs w:val="20"/>
-        </w:rPr>
-      </w:pPr>
-      <w:r>
-        <w:rPr>
-          <w:rtl w:val="0"/>
-        </w:rPr>
-      </w:r>
-    </w:p>
-    <w:p>
-      <w:pPr>
-        <w:spacing w:line="240" w:lineRule="auto"/>
-        <w:ind w:right="360"/>
+        <w:ind w:left="720" w:right="0" w:hanging="360"/>
+        <w:rPr>
+          <w:rFonts w:ascii="Times New Roman" w:cs="Times New Roman" w:eastAsia="Times New Roman" w:hAnsi="Times New Roman"/>
+        </w:rPr>
+      </w:pPr>
+      <w:r>
+        <w:rPr>
+          <w:rFonts w:ascii="Times New Roman" w:cs="Times New Roman" w:eastAsia="Times New Roman" w:hAnsi="Times New Roman"/>
+          <w:b w:val="1"/>
+          <w:bCs w:val="1"/>
+          <w:rtl w:val="0"/>
+        </w:rPr>
+        <w:t xml:space="preserve">Containerized application</w:t>
+      </w:r>
+      <w:r>
+        <w:rPr>
+          <w:rFonts w:ascii="Times New Roman" w:cs="Times New Roman" w:eastAsia="Times New Roman" w:hAnsi="Times New Roman"/>
+          <w:rtl w:val="0"/>
+        </w:rPr>
+        <w:t xml:space="preserve"> using Docker improving environment consistency and developer onboarding speed</w:t>
+      </w:r>
+    </w:p>
+    <w:p>
+      <w:pPr>
+        <w:spacing w:line="240" w:lineRule="auto"/>
+        <w:ind w:left="0" w:right="0" w:firstLine="0"/>
+        <w:rPr>
+          <w:rFonts w:ascii="Times New Roman" w:cs="Times New Roman" w:eastAsia="Times New Roman" w:hAnsi="Times New Roman"/>
+        </w:rPr>
+      </w:pPr>
+      <w:r>
+        <w:rPr>
+          <w:rtl w:val="0"/>
+        </w:rPr>
+      </w:r>
+    </w:p>
+    <w:p>
+      <w:pPr>
+        <w:spacing w:line="240" w:lineRule="auto"/>
+        <w:ind w:right="0" w:firstLine="720"/>
+        <w:rPr>
+          <w:rFonts w:ascii="Times New Roman" w:cs="Times New Roman" w:eastAsia="Times New Roman" w:hAnsi="Times New Roman"/>
+        </w:rPr>
+      </w:pPr>
+      <w:r>
+        <w:rPr>
+          <w:rFonts w:ascii="Times New Roman" w:cs="Times New Roman" w:eastAsia="Times New Roman" w:hAnsi="Times New Roman"/>
+          <w:b w:val="1"/>
+          <w:bCs w:val="1"/>
+          <w:rtl w:val="0"/>
+        </w:rPr>
+        <w:t xml:space="preserve">Tech:</w:t>
+      </w:r>
+      <w:r>
+        <w:rPr>
+          <w:rFonts w:ascii="Times New Roman" w:cs="Times New Roman" w:eastAsia="Times New Roman" w:hAnsi="Times New Roman"/>
+          <w:rtl w:val="0"/>
+        </w:rPr>
+        <w:t xml:space="preserve"> Next.js (React), Sitecore XM Cloud, REST APIs, SSG, CSS/SASS, Docker</w:t>
+      </w:r>
+    </w:p>
+    <w:p>
+      <w:pPr>
+        <w:ind w:right="0"/>
+        <w:rPr>
+          <w:rFonts w:ascii="Times New Roman" w:cs="Times New Roman" w:eastAsia="Times New Roman" w:hAnsi="Times New Roman"/>
+        </w:rPr>
+      </w:pPr>
+      <w:r>
+        <w:rPr>
+          <w:rtl w:val="0"/>
+        </w:rPr>
+      </w:r>
+    </w:p>
+    <w:p>
+      <w:pPr>
+        <w:spacing w:line="240" w:lineRule="auto"/>
+        <w:ind w:right="0"/>
         <w:rPr>
           <w:rFonts w:ascii="Times New Roman" w:cs="Times New Roman" w:eastAsia="Times New Roman" w:hAnsi="Times New Roman"/>
           <w:i w:val="1"/>
           <w:iCs w:val="1"/>
-          <w:sz w:val="24"/>
-          <w:szCs w:val="24"/>
-        </w:rPr>
-      </w:pPr>
-      <w:r>
-        <w:rPr>
-          <w:rFonts w:ascii="Times New Roman" w:cs="Times New Roman" w:eastAsia="Times New Roman" w:hAnsi="Times New Roman"/>
-          <w:b w:val="1"/>
-          <w:bCs w:val="1"/>
-          <w:sz w:val="24"/>
-          <w:szCs w:val="24"/>
+        </w:rPr>
+      </w:pPr>
+      <w:r>
+        <w:rPr>
+          <w:rFonts w:ascii="Times New Roman" w:cs="Times New Roman" w:eastAsia="Times New Roman" w:hAnsi="Times New Roman"/>
+          <w:b w:val="1"/>
+          <w:bCs w:val="1"/>
           <w:rtl w:val="0"/>
         </w:rPr>
         <w:t xml:space="preserve">Data Integration Service Modernization</w:t>
@@ -1153,13 +1265,11 @@
           <w:tab w:val="right" w:leader="none" w:pos="9360"/>
         </w:tabs>
         <w:spacing w:line="240" w:lineRule="auto"/>
-        <w:ind w:right="360"/>
+        <w:ind w:right="0"/>
         <w:rPr>
           <w:rFonts w:ascii="Times New Roman" w:cs="Times New Roman" w:eastAsia="Times New Roman" w:hAnsi="Times New Roman"/>
           <w:i w:val="1"/>
           <w:iCs w:val="1"/>
-          <w:sz w:val="24"/>
-          <w:szCs w:val="24"/>
         </w:rPr>
       </w:pPr>
       <w:r>
@@ -1167,8 +1277,6 @@
           <w:rFonts w:ascii="Times New Roman" w:cs="Times New Roman" w:eastAsia="Times New Roman" w:hAnsi="Times New Roman"/>
           <w:i w:val="1"/>
           <w:iCs w:val="1"/>
-          <w:sz w:val="24"/>
-          <w:szCs w:val="24"/>
           <w:rtl w:val="0"/>
         </w:rPr>
         <w:t xml:space="preserve">Brightcove Connector for Sitecore </w:t>
@@ -1179,13 +1287,11 @@
     <w:p>
       <w:pPr>
         <w:spacing w:line="240" w:lineRule="auto"/>
-        <w:ind w:right="360"/>
+        <w:ind w:right="0"/>
         <w:rPr>
           <w:rFonts w:ascii="Times New Roman" w:cs="Times New Roman" w:eastAsia="Times New Roman" w:hAnsi="Times New Roman"/>
           <w:i w:val="1"/>
           <w:iCs w:val="1"/>
-          <w:sz w:val="24"/>
-          <w:szCs w:val="24"/>
         </w:rPr>
       </w:pPr>
       <w:r>
@@ -1201,21 +1307,26 @@
           <w:numId w:val="3"/>
         </w:numPr>
         <w:spacing w:line="240" w:lineRule="auto"/>
-        <w:ind w:left="720" w:right="360" w:hanging="360"/>
-        <w:rPr>
-          <w:rFonts w:ascii="Times New Roman" w:cs="Times New Roman" w:eastAsia="Times New Roman" w:hAnsi="Times New Roman"/>
-          <w:sz w:val="24"/>
-          <w:szCs w:val="24"/>
-        </w:rPr>
-      </w:pPr>
-      <w:r>
-        <w:rPr>
-          <w:rFonts w:ascii="Times New Roman" w:cs="Times New Roman" w:eastAsia="Times New Roman" w:hAnsi="Times New Roman"/>
-          <w:sz w:val="24"/>
-          <w:szCs w:val="24"/>
-          <w:rtl w:val="0"/>
-        </w:rPr>
-        <w:t xml:space="preserve">Lead developer for the full redesign of a legacy backend data integration service, written in C#, focused on removing deprecated dependencies to improve long-term maintainability</w:t>
+        <w:ind w:left="720" w:right="0" w:hanging="360"/>
+        <w:rPr>
+          <w:rFonts w:ascii="Times New Roman" w:cs="Times New Roman" w:eastAsia="Times New Roman" w:hAnsi="Times New Roman"/>
+        </w:rPr>
+      </w:pPr>
+      <w:r>
+        <w:rPr>
+          <w:rFonts w:ascii="Times New Roman" w:cs="Times New Roman" w:eastAsia="Times New Roman" w:hAnsi="Times New Roman"/>
+          <w:b w:val="1"/>
+          <w:bCs w:val="1"/>
+          <w:rtl w:val="0"/>
+        </w:rPr>
+        <w:t xml:space="preserve">Led the modernization of a legacy .NET service</w:t>
+      </w:r>
+      <w:r>
+        <w:rPr>
+          <w:rFonts w:ascii="Times New Roman" w:cs="Times New Roman" w:eastAsia="Times New Roman" w:hAnsi="Times New Roman"/>
+          <w:rtl w:val="0"/>
+        </w:rPr>
+        <w:t xml:space="preserve">, removing deprecated dependencies and improving long-term maintainability</w:t>
       </w:r>
     </w:p>
     <w:p>
@@ -1225,21 +1336,33 @@
           <w:numId w:val="3"/>
         </w:numPr>
         <w:spacing w:line="240" w:lineRule="auto"/>
-        <w:ind w:left="720" w:right="360" w:hanging="360"/>
-        <w:rPr>
-          <w:rFonts w:ascii="Times New Roman" w:cs="Times New Roman" w:eastAsia="Times New Roman" w:hAnsi="Times New Roman"/>
-          <w:sz w:val="24"/>
-          <w:szCs w:val="24"/>
-        </w:rPr>
-      </w:pPr>
-      <w:r>
-        <w:rPr>
-          <w:rFonts w:ascii="Times New Roman" w:cs="Times New Roman" w:eastAsia="Times New Roman" w:hAnsi="Times New Roman"/>
-          <w:sz w:val="24"/>
-          <w:szCs w:val="24"/>
-          <w:rtl w:val="0"/>
-        </w:rPr>
-        <w:t xml:space="preserve">Rebuilt core components while maintaining backward compatibility for existing enterprise clients</w:t>
+        <w:ind w:left="720" w:right="0" w:hanging="360"/>
+        <w:rPr>
+          <w:rFonts w:ascii="Times New Roman" w:cs="Times New Roman" w:eastAsia="Times New Roman" w:hAnsi="Times New Roman"/>
+        </w:rPr>
+      </w:pPr>
+      <w:r>
+        <w:rPr>
+          <w:rFonts w:ascii="Times New Roman" w:cs="Times New Roman" w:eastAsia="Times New Roman" w:hAnsi="Times New Roman"/>
+          <w:rtl w:val="0"/>
+        </w:rPr>
+        <w:t xml:space="preserve">Redesigned core components while </w:t>
+      </w:r>
+      <w:r>
+        <w:rPr>
+          <w:rFonts w:ascii="Times New Roman" w:cs="Times New Roman" w:eastAsia="Times New Roman" w:hAnsi="Times New Roman"/>
+          <w:b w:val="1"/>
+          <w:bCs w:val="1"/>
+          <w:rtl w:val="0"/>
+        </w:rPr>
+        <w:t xml:space="preserve">maintaining backward compatibility</w:t>
+      </w:r>
+      <w:r>
+        <w:rPr>
+          <w:rFonts w:ascii="Times New Roman" w:cs="Times New Roman" w:eastAsia="Times New Roman" w:hAnsi="Times New Roman"/>
+          <w:rtl w:val="0"/>
+        </w:rPr>
+        <w:t xml:space="preserve"> for enterprise clients</w:t>
       </w:r>
     </w:p>
     <w:p>
@@ -1249,21 +1372,26 @@
           <w:numId w:val="3"/>
         </w:numPr>
         <w:spacing w:line="240" w:lineRule="auto"/>
-        <w:ind w:left="720" w:right="360" w:hanging="360"/>
-        <w:rPr>
-          <w:rFonts w:ascii="Times New Roman" w:cs="Times New Roman" w:eastAsia="Times New Roman" w:hAnsi="Times New Roman"/>
-          <w:sz w:val="24"/>
-          <w:szCs w:val="24"/>
-        </w:rPr>
-      </w:pPr>
-      <w:r>
-        <w:rPr>
-          <w:rFonts w:ascii="Times New Roman" w:cs="Times New Roman" w:eastAsia="Times New Roman" w:hAnsi="Times New Roman"/>
-          <w:sz w:val="24"/>
-          <w:szCs w:val="24"/>
-          <w:rtl w:val="0"/>
-        </w:rPr>
-        <w:t xml:space="preserve">Improved operational efficiency and developer onboarding by creating, written and video, technical documentation and system-level guidance for client engineering teams.</w:t>
+        <w:ind w:left="720" w:right="0" w:hanging="360"/>
+        <w:rPr>
+          <w:rFonts w:ascii="Times New Roman" w:cs="Times New Roman" w:eastAsia="Times New Roman" w:hAnsi="Times New Roman"/>
+        </w:rPr>
+      </w:pPr>
+      <w:r>
+        <w:rPr>
+          <w:rFonts w:ascii="Times New Roman" w:cs="Times New Roman" w:eastAsia="Times New Roman" w:hAnsi="Times New Roman"/>
+          <w:b w:val="1"/>
+          <w:bCs w:val="1"/>
+          <w:rtl w:val="0"/>
+        </w:rPr>
+        <w:t xml:space="preserve">Owned Tier-4 production support</w:t>
+      </w:r>
+      <w:r>
+        <w:rPr>
+          <w:rFonts w:ascii="Times New Roman" w:cs="Times New Roman" w:eastAsia="Times New Roman" w:hAnsi="Times New Roman"/>
+          <w:rtl w:val="0"/>
+        </w:rPr>
+        <w:t xml:space="preserve"> for 3+ years, diagnosing and resolving production and onboarding issues for enterprise clients</w:t>
       </w:r>
     </w:p>
     <w:p>
@@ -1273,58 +1401,103 @@
           <w:numId w:val="3"/>
         </w:numPr>
         <w:spacing w:line="240" w:lineRule="auto"/>
-        <w:ind w:left="720" w:right="360" w:hanging="360"/>
-        <w:rPr>
-          <w:rFonts w:ascii="Times New Roman" w:cs="Times New Roman" w:eastAsia="Times New Roman" w:hAnsi="Times New Roman"/>
-          <w:sz w:val="24"/>
-          <w:szCs w:val="24"/>
-        </w:rPr>
-      </w:pPr>
-      <w:r>
-        <w:rPr>
-          <w:rFonts w:ascii="Times New Roman" w:cs="Times New Roman" w:eastAsia="Times New Roman" w:hAnsi="Times New Roman"/>
-          <w:sz w:val="24"/>
-          <w:szCs w:val="24"/>
-          <w:rtl w:val="0"/>
-        </w:rPr>
-        <w:t xml:space="preserve">Owned long-term Tier-4 production support (3+ years), diagnosing and resolving client integration issues</w:t>
-      </w:r>
-    </w:p>
-    <w:p>
-      <w:pPr>
-        <w:spacing w:line="240" w:lineRule="auto"/>
-        <w:ind w:left="720" w:right="360" w:firstLine="0"/>
-        <w:rPr>
-          <w:rFonts w:ascii="Times New Roman" w:cs="Times New Roman" w:eastAsia="Times New Roman" w:hAnsi="Times New Roman"/>
-          <w:sz w:val="24"/>
-          <w:szCs w:val="24"/>
-        </w:rPr>
-      </w:pPr>
-      <w:r>
-        <w:rPr>
-          <w:rtl w:val="0"/>
-        </w:rPr>
-      </w:r>
-    </w:p>
-    <w:p>
-      <w:pPr>
-        <w:spacing w:line="240" w:lineRule="auto"/>
-        <w:ind w:right="360"/>
+        <w:ind w:left="720" w:right="0" w:hanging="360"/>
+        <w:rPr>
+          <w:rFonts w:ascii="Times New Roman" w:cs="Times New Roman" w:eastAsia="Times New Roman" w:hAnsi="Times New Roman"/>
+        </w:rPr>
+      </w:pPr>
+      <w:r>
+        <w:rPr>
+          <w:rFonts w:ascii="Times New Roman" w:cs="Times New Roman" w:eastAsia="Times New Roman" w:hAnsi="Times New Roman"/>
+          <w:rtl w:val="0"/>
+        </w:rPr>
+        <w:t xml:space="preserve">Created comprehensive </w:t>
+      </w:r>
+      <w:r>
+        <w:rPr>
+          <w:rFonts w:ascii="Times New Roman" w:cs="Times New Roman" w:eastAsia="Times New Roman" w:hAnsi="Times New Roman"/>
+          <w:b w:val="1"/>
+          <w:bCs w:val="1"/>
+          <w:rtl w:val="0"/>
+        </w:rPr>
+        <w:t xml:space="preserve">technical documentation and onboarding materials</w:t>
+      </w:r>
+      <w:r>
+        <w:rPr>
+          <w:rFonts w:ascii="Times New Roman" w:cs="Times New Roman" w:eastAsia="Times New Roman" w:hAnsi="Times New Roman"/>
+          <w:rtl w:val="0"/>
+        </w:rPr>
+        <w:t xml:space="preserve">, improving adoption and reducing ramp-up time for client teams</w:t>
+      </w:r>
+    </w:p>
+    <w:p>
+      <w:pPr>
+        <w:spacing w:line="240" w:lineRule="auto"/>
+        <w:ind w:left="0" w:right="0" w:firstLine="0"/>
+        <w:rPr>
+          <w:rFonts w:ascii="Times New Roman" w:cs="Times New Roman" w:eastAsia="Times New Roman" w:hAnsi="Times New Roman"/>
+        </w:rPr>
+      </w:pPr>
+      <w:r>
+        <w:rPr>
+          <w:rtl w:val="0"/>
+        </w:rPr>
+      </w:r>
+    </w:p>
+    <w:p>
+      <w:pPr>
+        <w:spacing w:line="240" w:lineRule="auto"/>
+        <w:ind w:left="0" w:right="0" w:firstLine="720"/>
+        <w:rPr>
+          <w:rFonts w:ascii="Times New Roman" w:cs="Times New Roman" w:eastAsia="Times New Roman" w:hAnsi="Times New Roman"/>
+        </w:rPr>
+      </w:pPr>
+      <w:r>
+        <w:rPr>
+          <w:rFonts w:ascii="Times New Roman" w:cs="Times New Roman" w:eastAsia="Times New Roman" w:hAnsi="Times New Roman"/>
+          <w:b w:val="1"/>
+          <w:bCs w:val="1"/>
+          <w:rtl w:val="0"/>
+        </w:rPr>
+        <w:t xml:space="preserve">Tech</w:t>
+      </w:r>
+      <w:r>
+        <w:rPr>
+          <w:rFonts w:ascii="Times New Roman" w:cs="Times New Roman" w:eastAsia="Times New Roman" w:hAnsi="Times New Roman"/>
+          <w:rtl w:val="0"/>
+        </w:rPr>
+        <w:t xml:space="preserve">: C#, ASP.NET, Sitecore, Brightcove, MVC, HTML/CSS</w:t>
+      </w:r>
+    </w:p>
+    <w:p>
+      <w:pPr>
+        <w:spacing w:line="240" w:lineRule="auto"/>
+        <w:ind w:left="0" w:right="0" w:firstLine="0"/>
+        <w:rPr>
+          <w:rFonts w:ascii="Times New Roman" w:cs="Times New Roman" w:eastAsia="Times New Roman" w:hAnsi="Times New Roman"/>
+        </w:rPr>
+      </w:pPr>
+      <w:r>
+        <w:rPr>
+          <w:rtl w:val="0"/>
+        </w:rPr>
+      </w:r>
+    </w:p>
+    <w:p>
+      <w:pPr>
+        <w:spacing w:line="240" w:lineRule="auto"/>
+        <w:ind w:right="0"/>
         <w:rPr>
           <w:rFonts w:ascii="Times New Roman" w:cs="Times New Roman" w:eastAsia="Times New Roman" w:hAnsi="Times New Roman"/>
           <w:i w:val="1"/>
           <w:iCs w:val="1"/>
-          <w:sz w:val="24"/>
-          <w:szCs w:val="24"/>
-        </w:rPr>
-      </w:pPr>
-      <w:r>
-        <w:rPr>
-          <w:rFonts w:ascii="Times New Roman" w:cs="Times New Roman" w:eastAsia="Times New Roman" w:hAnsi="Times New Roman"/>
-          <w:b w:val="1"/>
-          <w:bCs w:val="1"/>
-          <w:sz w:val="24"/>
-          <w:szCs w:val="24"/>
+        </w:rPr>
+      </w:pPr>
+      <w:r>
+        <w:rPr>
+          <w:rFonts w:ascii="Times New Roman" w:cs="Times New Roman" w:eastAsia="Times New Roman" w:hAnsi="Times New Roman"/>
+          <w:b w:val="1"/>
+          <w:bCs w:val="1"/>
           <w:rtl w:val="0"/>
         </w:rPr>
         <w:t xml:space="preserve">New eCommerce Site</w:t>
@@ -1341,13 +1514,11 @@
           <w:tab w:val="right" w:leader="none" w:pos="9360"/>
         </w:tabs>
         <w:spacing w:line="240" w:lineRule="auto"/>
-        <w:ind w:right="360"/>
+        <w:ind w:right="0"/>
         <w:rPr>
           <w:rFonts w:ascii="Times New Roman" w:cs="Times New Roman" w:eastAsia="Times New Roman" w:hAnsi="Times New Roman"/>
           <w:i w:val="1"/>
           <w:iCs w:val="1"/>
-          <w:sz w:val="24"/>
-          <w:szCs w:val="24"/>
         </w:rPr>
       </w:pPr>
       <w:r>
@@ -1355,8 +1526,6 @@
           <w:rFonts w:ascii="Times New Roman" w:cs="Times New Roman" w:eastAsia="Times New Roman" w:hAnsi="Times New Roman"/>
           <w:i w:val="1"/>
           <w:iCs w:val="1"/>
-          <w:sz w:val="24"/>
-          <w:szCs w:val="24"/>
           <w:rtl w:val="0"/>
         </w:rPr>
         <w:t xml:space="preserve">Dorel Sports Online Store </w:t>
@@ -1367,13 +1536,11 @@
     <w:p>
       <w:pPr>
         <w:spacing w:line="240" w:lineRule="auto"/>
-        <w:ind w:right="360"/>
+        <w:ind w:right="0"/>
         <w:rPr>
           <w:rFonts w:ascii="Times New Roman" w:cs="Times New Roman" w:eastAsia="Times New Roman" w:hAnsi="Times New Roman"/>
           <w:i w:val="1"/>
           <w:iCs w:val="1"/>
-          <w:sz w:val="24"/>
-          <w:szCs w:val="24"/>
         </w:rPr>
       </w:pPr>
       <w:r>
@@ -1389,39 +1556,26 @@
           <w:numId w:val="1"/>
         </w:numPr>
         <w:spacing w:line="240" w:lineRule="auto"/>
-        <w:ind w:left="720" w:right="360" w:hanging="360"/>
-        <w:rPr>
-          <w:rFonts w:ascii="Times New Roman" w:cs="Times New Roman" w:eastAsia="Times New Roman" w:hAnsi="Times New Roman"/>
-          <w:sz w:val="24"/>
-          <w:szCs w:val="24"/>
-        </w:rPr>
-      </w:pPr>
-      <w:r>
-        <w:rPr>
-          <w:rFonts w:ascii="Times New Roman" w:cs="Times New Roman" w:eastAsia="Times New Roman" w:hAnsi="Times New Roman"/>
-          <w:sz w:val="24"/>
-          <w:szCs w:val="24"/>
-          <w:rtl w:val="0"/>
-        </w:rPr>
-        <w:t xml:space="preserve">Developed backend services and MVC components for an </w:t>
-      </w:r>
-      <w:r>
-        <w:rPr>
-          <w:rFonts w:ascii="Times New Roman" w:cs="Times New Roman" w:eastAsia="Times New Roman" w:hAnsi="Times New Roman"/>
-          <w:sz w:val="24"/>
-          <w:szCs w:val="24"/>
-          <w:rtl w:val="0"/>
-        </w:rPr>
-        <w:t xml:space="preserve">ASP.NET</w:t>
-      </w:r>
-      <w:r>
-        <w:rPr>
-          <w:rFonts w:ascii="Times New Roman" w:cs="Times New Roman" w:eastAsia="Times New Roman" w:hAnsi="Times New Roman"/>
-          <w:sz w:val="24"/>
-          <w:szCs w:val="24"/>
-          <w:rtl w:val="0"/>
-        </w:rPr>
-        <w:t xml:space="preserve"> eCommerce site supporting thousands of products</w:t>
+        <w:ind w:left="720" w:right="0" w:hanging="360"/>
+        <w:rPr>
+          <w:rFonts w:ascii="Times New Roman" w:cs="Times New Roman" w:eastAsia="Times New Roman" w:hAnsi="Times New Roman"/>
+        </w:rPr>
+      </w:pPr>
+      <w:r>
+        <w:rPr>
+          <w:rFonts w:ascii="Times New Roman" w:cs="Times New Roman" w:eastAsia="Times New Roman" w:hAnsi="Times New Roman"/>
+          <w:b w:val="1"/>
+          <w:bCs w:val="1"/>
+          <w:rtl w:val="0"/>
+        </w:rPr>
+        <w:t xml:space="preserve">Built backend services and MVC components</w:t>
+      </w:r>
+      <w:r>
+        <w:rPr>
+          <w:rFonts w:ascii="Times New Roman" w:cs="Times New Roman" w:eastAsia="Times New Roman" w:hAnsi="Times New Roman"/>
+          <w:rtl w:val="0"/>
+        </w:rPr>
+        <w:t xml:space="preserve"> for an ASP.NET eCommerce website</w:t>
       </w:r>
     </w:p>
     <w:p>
@@ -1431,21 +1585,33 @@
           <w:numId w:val="1"/>
         </w:numPr>
         <w:spacing w:line="240" w:lineRule="auto"/>
-        <w:ind w:left="720" w:right="360" w:hanging="360"/>
-        <w:rPr>
-          <w:rFonts w:ascii="Times New Roman" w:cs="Times New Roman" w:eastAsia="Times New Roman" w:hAnsi="Times New Roman"/>
-          <w:sz w:val="24"/>
-          <w:szCs w:val="24"/>
-        </w:rPr>
-      </w:pPr>
-      <w:r>
-        <w:rPr>
-          <w:rFonts w:ascii="Times New Roman" w:cs="Times New Roman" w:eastAsia="Times New Roman" w:hAnsi="Times New Roman"/>
-          <w:sz w:val="24"/>
-          <w:szCs w:val="24"/>
-          <w:rtl w:val="0"/>
-        </w:rPr>
-        <w:t xml:space="preserve">Implemented a unified backend data aggregation layer integrating Sitecore CMS, SAP, Shopify, and custom SQL data sources into a MongoDB datastore; to simplify data access and improve product information query performance</w:t>
+        <w:ind w:left="720" w:right="0" w:hanging="360"/>
+        <w:rPr>
+          <w:rFonts w:ascii="Times New Roman" w:cs="Times New Roman" w:eastAsia="Times New Roman" w:hAnsi="Times New Roman"/>
+        </w:rPr>
+      </w:pPr>
+      <w:r>
+        <w:rPr>
+          <w:rFonts w:ascii="Times New Roman" w:cs="Times New Roman" w:eastAsia="Times New Roman" w:hAnsi="Times New Roman"/>
+          <w:rtl w:val="0"/>
+        </w:rPr>
+        <w:t xml:space="preserve">Designed a </w:t>
+      </w:r>
+      <w:r>
+        <w:rPr>
+          <w:rFonts w:ascii="Times New Roman" w:cs="Times New Roman" w:eastAsia="Times New Roman" w:hAnsi="Times New Roman"/>
+          <w:b w:val="1"/>
+          <w:bCs w:val="1"/>
+          <w:rtl w:val="0"/>
+        </w:rPr>
+        <w:t xml:space="preserve">data aggregation layer</w:t>
+      </w:r>
+      <w:r>
+        <w:rPr>
+          <w:rFonts w:ascii="Times New Roman" w:cs="Times New Roman" w:eastAsia="Times New Roman" w:hAnsi="Times New Roman"/>
+          <w:rtl w:val="0"/>
+        </w:rPr>
+        <w:t xml:space="preserve"> integrating Sitecore, SAP, Shopify, and SQL sources into MongoDB, improving data access performance</w:t>
       </w:r>
     </w:p>
     <w:p>
@@ -1455,31 +1621,94 @@
           <w:numId w:val="1"/>
         </w:numPr>
         <w:spacing w:line="240" w:lineRule="auto"/>
-        <w:ind w:left="720" w:right="360" w:hanging="360"/>
-        <w:rPr>
-          <w:rFonts w:ascii="Times New Roman" w:cs="Times New Roman" w:eastAsia="Times New Roman" w:hAnsi="Times New Roman"/>
-          <w:sz w:val="24"/>
-          <w:szCs w:val="24"/>
-        </w:rPr>
-      </w:pPr>
-      <w:r>
-        <w:rPr>
-          <w:rFonts w:ascii="Times New Roman" w:cs="Times New Roman" w:eastAsia="Times New Roman" w:hAnsi="Times New Roman"/>
-          <w:sz w:val="24"/>
-          <w:szCs w:val="24"/>
-          <w:rtl w:val="0"/>
-        </w:rPr>
-        <w:t xml:space="preserve">Designed Infrastructure-as-Code using Terraform and Packer to enable consistent environment provisioning and more reliable deployments across environments</w:t>
-      </w:r>
-    </w:p>
-    <w:p>
-      <w:pPr>
-        <w:spacing w:line="240" w:lineRule="auto"/>
-        <w:ind w:left="720" w:right="360" w:firstLine="0"/>
-        <w:rPr>
-          <w:rFonts w:ascii="Times New Roman" w:cs="Times New Roman" w:eastAsia="Times New Roman" w:hAnsi="Times New Roman"/>
-          <w:sz w:val="24"/>
-          <w:szCs w:val="24"/>
+        <w:ind w:left="720" w:right="0" w:hanging="360"/>
+        <w:rPr>
+          <w:rFonts w:ascii="Times New Roman" w:cs="Times New Roman" w:eastAsia="Times New Roman" w:hAnsi="Times New Roman"/>
+        </w:rPr>
+      </w:pPr>
+      <w:r>
+        <w:rPr>
+          <w:rFonts w:ascii="Times New Roman" w:cs="Times New Roman" w:eastAsia="Times New Roman" w:hAnsi="Times New Roman"/>
+          <w:rtl w:val="0"/>
+        </w:rPr>
+        <w:t xml:space="preserve">Implemented </w:t>
+      </w:r>
+      <w:r>
+        <w:rPr>
+          <w:rFonts w:ascii="Times New Roman" w:cs="Times New Roman" w:eastAsia="Times New Roman" w:hAnsi="Times New Roman"/>
+          <w:b w:val="1"/>
+          <w:bCs w:val="1"/>
+          <w:rtl w:val="0"/>
+        </w:rPr>
+        <w:t xml:space="preserve">Infrastructure-as-Code (Terraform, Packer)</w:t>
+      </w:r>
+      <w:r>
+        <w:rPr>
+          <w:rFonts w:ascii="Times New Roman" w:cs="Times New Roman" w:eastAsia="Times New Roman" w:hAnsi="Times New Roman"/>
+          <w:rtl w:val="0"/>
+        </w:rPr>
+        <w:t xml:space="preserve"> to standardize environment provisioning and improve deployment reliability</w:t>
+      </w:r>
+    </w:p>
+    <w:p>
+      <w:pPr>
+        <w:spacing w:line="240" w:lineRule="auto"/>
+        <w:ind w:left="720" w:right="0" w:firstLine="0"/>
+        <w:rPr>
+          <w:rFonts w:ascii="Times New Roman" w:cs="Times New Roman" w:eastAsia="Times New Roman" w:hAnsi="Times New Roman"/>
+        </w:rPr>
+      </w:pPr>
+      <w:r>
+        <w:rPr>
+          <w:rtl w:val="0"/>
+        </w:rPr>
+      </w:r>
+    </w:p>
+    <w:p>
+      <w:pPr>
+        <w:spacing w:line="240" w:lineRule="auto"/>
+        <w:ind w:right="0" w:firstLine="720"/>
+        <w:rPr>
+          <w:rFonts w:ascii="Times New Roman" w:cs="Times New Roman" w:eastAsia="Times New Roman" w:hAnsi="Times New Roman"/>
+        </w:rPr>
+      </w:pPr>
+      <w:r>
+        <w:rPr>
+          <w:rFonts w:ascii="Times New Roman" w:cs="Times New Roman" w:eastAsia="Times New Roman" w:hAnsi="Times New Roman"/>
+          <w:b w:val="1"/>
+          <w:bCs w:val="1"/>
+          <w:rtl w:val="0"/>
+        </w:rPr>
+        <w:t xml:space="preserve">Tech</w:t>
+      </w:r>
+      <w:r>
+        <w:rPr>
+          <w:rFonts w:ascii="Times New Roman" w:cs="Times New Roman" w:eastAsia="Times New Roman" w:hAnsi="Times New Roman"/>
+          <w:rtl w:val="0"/>
+        </w:rPr>
+        <w:t xml:space="preserve">: C#, </w:t>
+      </w:r>
+      <w:r>
+        <w:rPr>
+          <w:rFonts w:ascii="Times New Roman" w:cs="Times New Roman" w:eastAsia="Times New Roman" w:hAnsi="Times New Roman"/>
+          <w:rtl w:val="0"/>
+        </w:rPr>
+        <w:t xml:space="preserve">ASP.NET</w:t>
+      </w:r>
+      <w:r>
+        <w:rPr>
+          <w:rFonts w:ascii="Times New Roman" w:cs="Times New Roman" w:eastAsia="Times New Roman" w:hAnsi="Times New Roman"/>
+          <w:rtl w:val="0"/>
+        </w:rPr>
+        <w:t xml:space="preserve">, Terraform, Packer, Azure, MVC, HTML/CSS</w:t>
+      </w:r>
+    </w:p>
+    <w:p>
+      <w:pPr>
+        <w:spacing w:line="240" w:lineRule="auto"/>
+        <w:ind w:left="0" w:right="0" w:firstLine="0"/>
+        <w:rPr>
+          <w:rFonts w:ascii="Times New Roman" w:cs="Times New Roman" w:eastAsia="Times New Roman" w:hAnsi="Times New Roman"/>
         </w:rPr>
       </w:pPr>
       <w:r>
@@ -1491,17 +1720,17 @@
     <w:p>
       <w:pPr>
         <w:pBdr>
-          <w:bottom w:color="666666" w:space="2" w:sz="8" w:val="single"/>
+          <w:bottom w:color="0b5394" w:space="2" w:sz="8" w:val="single"/>
         </w:pBdr>
         <w:spacing w:line="240" w:lineRule="auto"/>
-        <w:ind w:right="360"/>
+        <w:ind w:right="0"/>
         <w:rPr>
           <w:rFonts w:ascii="Times New Roman" w:cs="Times New Roman" w:eastAsia="Times New Roman" w:hAnsi="Times New Roman"/>
           <w:b w:val="1"/>
           <w:bCs w:val="1"/>
           <w:color w:val="0b5394"/>
-          <w:sz w:val="32"/>
-          <w:szCs w:val="32"/>
+          <w:sz w:val="28"/>
+          <w:szCs w:val="28"/>
         </w:rPr>
       </w:pPr>
       <w:r>
@@ -1510,8 +1739,8 @@
           <w:b w:val="1"/>
           <w:bCs w:val="1"/>
           <w:color w:val="0b5394"/>
-          <w:sz w:val="32"/>
-          <w:szCs w:val="32"/>
+          <w:sz w:val="28"/>
+          <w:szCs w:val="28"/>
           <w:rtl w:val="0"/>
         </w:rPr>
         <w:t xml:space="preserve">Education</w:t>
@@ -1520,38 +1749,32 @@
     <w:p>
       <w:pPr>
         <w:spacing w:line="240" w:lineRule="auto"/>
-        <w:ind w:right="360"/>
-        <w:rPr>
-          <w:rFonts w:ascii="Times New Roman" w:cs="Times New Roman" w:eastAsia="Times New Roman" w:hAnsi="Times New Roman"/>
-          <w:sz w:val="24"/>
-          <w:szCs w:val="24"/>
-        </w:rPr>
-      </w:pPr>
-      <w:r>
-        <w:rPr>
-          <w:rtl w:val="0"/>
-        </w:rPr>
-      </w:r>
-    </w:p>
-    <w:p>
-      <w:pPr>
-        <w:spacing w:line="240" w:lineRule="auto"/>
-        <w:ind w:right="360"/>
-        <w:rPr>
-          <w:rFonts w:ascii="Times New Roman" w:cs="Times New Roman" w:eastAsia="Times New Roman" w:hAnsi="Times New Roman"/>
-          <w:b w:val="1"/>
-          <w:bCs w:val="1"/>
-          <w:sz w:val="24"/>
-          <w:szCs w:val="24"/>
-        </w:rPr>
-      </w:pPr>
-      <w:r>
-        <w:rPr>
-          <w:rFonts w:ascii="Times New Roman" w:cs="Times New Roman" w:eastAsia="Times New Roman" w:hAnsi="Times New Roman"/>
-          <w:b w:val="1"/>
-          <w:bCs w:val="1"/>
-          <w:sz w:val="24"/>
-          <w:szCs w:val="24"/>
+        <w:ind w:right="0"/>
+        <w:rPr>
+          <w:rFonts w:ascii="Times New Roman" w:cs="Times New Roman" w:eastAsia="Times New Roman" w:hAnsi="Times New Roman"/>
+        </w:rPr>
+      </w:pPr>
+      <w:r>
+        <w:rPr>
+          <w:rtl w:val="0"/>
+        </w:rPr>
+      </w:r>
+    </w:p>
+    <w:p>
+      <w:pPr>
+        <w:spacing w:line="240" w:lineRule="auto"/>
+        <w:ind w:right="0"/>
+        <w:rPr>
+          <w:rFonts w:ascii="Times New Roman" w:cs="Times New Roman" w:eastAsia="Times New Roman" w:hAnsi="Times New Roman"/>
+          <w:b w:val="1"/>
+          <w:bCs w:val="1"/>
+        </w:rPr>
+      </w:pPr>
+      <w:r>
+        <w:rPr>
+          <w:rFonts w:ascii="Times New Roman" w:cs="Times New Roman" w:eastAsia="Times New Roman" w:hAnsi="Times New Roman"/>
+          <w:b w:val="1"/>
+          <w:bCs w:val="1"/>
           <w:rtl w:val="0"/>
         </w:rPr>
         <w:t xml:space="preserve">Bachelor of Science, Computer Science</w:t>
@@ -1563,11 +1786,9 @@
           <w:tab w:val="right" w:leader="none" w:pos="9360"/>
         </w:tabs>
         <w:spacing w:line="240" w:lineRule="auto"/>
-        <w:ind w:right="360"/>
-        <w:rPr>
-          <w:rFonts w:ascii="Times New Roman" w:cs="Times New Roman" w:eastAsia="Times New Roman" w:hAnsi="Times New Roman"/>
-          <w:sz w:val="24"/>
-          <w:szCs w:val="24"/>
+        <w:ind w:right="0"/>
+        <w:rPr>
+          <w:rFonts w:ascii="Times New Roman" w:cs="Times New Roman" w:eastAsia="Times New Roman" w:hAnsi="Times New Roman"/>
         </w:rPr>
       </w:pPr>
       <w:r>
@@ -1575,8 +1796,6 @@
           <w:rFonts w:ascii="Times New Roman" w:cs="Times New Roman" w:eastAsia="Times New Roman" w:hAnsi="Times New Roman"/>
           <w:i w:val="1"/>
           <w:iCs w:val="1"/>
-          <w:sz w:val="24"/>
-          <w:szCs w:val="24"/>
           <w:rtl w:val="0"/>
         </w:rPr>
         <w:t xml:space="preserve">Temple University, College of Science and Technology </w:t>
@@ -1591,7 +1810,7 @@
     </w:p>
     <w:sectPr>
       <w:pgSz w:h="15840" w:w="12240" w:orient="portrait"/>
-      <w:pgMar w:bottom="1440" w:top="1440" w:left="1440" w:right="1080" w:header="720" w:footer="720"/>
+      <w:pgMar w:bottom="1440" w:top="1440" w:left="1440" w:right="1440" w:header="720" w:footer="720"/>
       <w:pgNumType w:start="1"/>
     </w:sectPr>
   </w:body>

</xml_diff>